<commit_message>
Fix customer onboarding guide: remove excessive page breaks
- Root cause of 'too much white space' complaint: a hard page break was
  forced after nearly every major section, leaving large blank areas on
  any page whose section content didn't fill the page
- Removed 8 of 10 page breaks, keeping only cover-page -> TOC and
  TOC -> content; everything else now flows naturally
- Document went from 13 sparse pages to 9 properly-filled pages
- Verified visually via actual Microsoft Word rendering (exported to
  PDF through Word itself, not just raw XML inspection)
- Re-confirmed zero real/sensitive data in final content
- Added docs/build_onboarding_doc.py (generation script) for
  reproducibility/future edits
</commit_message>
<xml_diff>
--- a/docs/customer-onboarding-guide.docx
+++ b/docs/customer-onboarding-guide.docx
@@ -2,81 +2,129 @@
 <file path=word/document.xml><?xml version="1.0" encoding="utf-8"?>
 <w:document xmlns:wpc="http://schemas.microsoft.com/office/word/2010/wordprocessingCanvas" xmlns:mo="http://schemas.microsoft.com/office/mac/office/2008/main" xmlns:mc="http://schemas.openxmlformats.org/markup-compatibility/2006" xmlns:mv="urn:schemas-microsoft-com:mac:vml" xmlns:o="urn:schemas-microsoft-com:office:office" xmlns:r="http://schemas.openxmlformats.org/officeDocument/2006/relationships" xmlns:m="http://schemas.openxmlformats.org/officeDocument/2006/math" xmlns:v="urn:schemas-microsoft-com:vml" xmlns:wp14="http://schemas.microsoft.com/office/word/2010/wordprocessingDrawing" xmlns:wp="http://schemas.openxmlformats.org/drawingml/2006/wordprocessingDrawing" xmlns:w10="urn:schemas-microsoft-com:office:word" xmlns:w="http://schemas.openxmlformats.org/wordprocessingml/2006/main" xmlns:w14="http://schemas.microsoft.com/office/word/2010/wordml" xmlns:wpg="http://schemas.microsoft.com/office/word/2010/wordprocessingGroup" xmlns:wpi="http://schemas.microsoft.com/office/word/2010/wordprocessingInk" xmlns:wne="http://schemas.microsoft.com/office/word/2006/wordml" xmlns:wps="http://schemas.microsoft.com/office/word/2010/wordprocessingShape" mc:Ignorable="w14 wp14">
   <w:body>
-    <w:p/>
-    <w:p/>
-    <w:p/>
-    <w:p/>
-    <w:p/>
-    <w:p/>
     <w:p>
       <w:pPr>
+        <w:spacing w:before="0" w:after="280" w:line="240" w:lineRule="auto"/>
+      </w:pPr>
+    </w:p>
+    <w:p>
+      <w:pPr>
+        <w:spacing w:before="0" w:after="280" w:line="240" w:lineRule="auto"/>
+      </w:pPr>
+    </w:p>
+    <w:p>
+      <w:pPr>
+        <w:spacing w:before="0" w:after="280" w:line="240" w:lineRule="auto"/>
+      </w:pPr>
+    </w:p>
+    <w:p>
+      <w:pPr>
+        <w:spacing w:before="0" w:after="280" w:line="240" w:lineRule="auto"/>
+      </w:pPr>
+    </w:p>
+    <w:p>
+      <w:pPr>
+        <w:spacing w:before="0" w:after="280" w:line="240" w:lineRule="auto"/>
+      </w:pPr>
+    </w:p>
+    <w:p>
+      <w:pPr>
+        <w:spacing w:before="0" w:after="80" w:line="240" w:lineRule="auto"/>
         <w:jc w:val="center"/>
       </w:pPr>
       <w:r>
         <w:rPr>
           <w:b/>
           <w:color w:val="E85C2E"/>
-          <w:sz w:val="68"/>
+          <w:sz w:val="64"/>
         </w:rPr>
         <w:t>AWS Zero Trust Gateway (ZTGW)</w:t>
       </w:r>
     </w:p>
     <w:p>
       <w:pPr>
+        <w:spacing w:before="0" w:after="200" w:line="240" w:lineRule="auto"/>
         <w:jc w:val="center"/>
       </w:pPr>
       <w:r>
         <w:rPr>
           <w:color w:val="1A1A1A"/>
-          <w:sz w:val="36"/>
+          <w:sz w:val="34"/>
         </w:rPr>
         <w:t>Terraform Deployment — Customer Onboarding Guide</w:t>
       </w:r>
     </w:p>
-    <w:p/>
     <w:p>
       <w:pPr>
+        <w:spacing w:before="0" w:after="0" w:line="312" w:lineRule="auto"/>
         <w:jc w:val="center"/>
       </w:pPr>
       <w:r>
         <w:rPr>
           <w:i/>
           <w:color w:val="5A5A5A"/>
-          <w:sz w:val="24"/>
+          <w:sz w:val="23"/>
         </w:rPr>
-        <w:t>Provisioning a Zscaler AWS Zero Trust Gateway and</w:t>
-        <w:br/>
-        <w:t>Gateway Load Balancer Endpoint using Infrastructure as Code</w:t>
+        <w:t>Provisioning a Zscaler AWS Zero Trust Gateway and Gateway Load Balancer Endpoint using Infrastructure as Code</w:t>
       </w:r>
     </w:p>
-    <w:p/>
-    <w:p/>
-    <w:p/>
-    <w:p/>
-    <w:p/>
-    <w:p/>
-    <w:p/>
-    <w:p/>
     <w:p>
       <w:pPr>
+        <w:spacing w:before="0" w:after="280" w:line="240" w:lineRule="auto"/>
+      </w:pPr>
+    </w:p>
+    <w:p>
+      <w:pPr>
+        <w:spacing w:before="0" w:after="280" w:line="240" w:lineRule="auto"/>
+      </w:pPr>
+    </w:p>
+    <w:p>
+      <w:pPr>
+        <w:spacing w:before="0" w:after="280" w:line="240" w:lineRule="auto"/>
+      </w:pPr>
+    </w:p>
+    <w:p>
+      <w:pPr>
+        <w:spacing w:before="0" w:after="280" w:line="240" w:lineRule="auto"/>
+      </w:pPr>
+    </w:p>
+    <w:p>
+      <w:pPr>
+        <w:spacing w:before="0" w:after="280" w:line="240" w:lineRule="auto"/>
+      </w:pPr>
+    </w:p>
+    <w:p>
+      <w:pPr>
+        <w:spacing w:before="0" w:after="280" w:line="240" w:lineRule="auto"/>
+      </w:pPr>
+    </w:p>
+    <w:p>
+      <w:pPr>
+        <w:spacing w:before="0" w:after="280" w:line="240" w:lineRule="auto"/>
+      </w:pPr>
+    </w:p>
+    <w:p>
+      <w:pPr>
+        <w:spacing w:before="0" w:after="40" w:line="240" w:lineRule="auto"/>
         <w:jc w:val="center"/>
       </w:pPr>
       <w:r>
         <w:rPr>
           <w:color w:val="5A5A5A"/>
-          <w:sz w:val="22"/>
+          <w:sz w:val="21"/>
         </w:rPr>
         <w:t>Document Version 1.0</w:t>
       </w:r>
     </w:p>
     <w:p>
       <w:pPr>
+        <w:spacing w:before="0" w:after="0" w:line="240" w:lineRule="auto"/>
         <w:jc w:val="center"/>
       </w:pPr>
       <w:r>
         <w:rPr>
           <w:color w:val="5A5A5A"/>
-          <w:sz w:val="22"/>
+          <w:sz w:val="21"/>
         </w:rPr>
         <w:t>Prepared for Customer Deployment Teams</w:t>
       </w:r>
@@ -96,111 +144,81 @@
     </w:p>
     <w:p>
       <w:pPr>
-        <w:spacing w:after="120"/>
+        <w:spacing w:before="0" w:after="100" w:line="240" w:lineRule="auto"/>
       </w:pPr>
       <w:r>
-        <w:rPr>
-          <w:sz w:val="24"/>
-        </w:rPr>
         <w:t>1. Overview</w:t>
       </w:r>
     </w:p>
     <w:p>
       <w:pPr>
-        <w:spacing w:after="120"/>
+        <w:spacing w:before="0" w:after="100" w:line="240" w:lineRule="auto"/>
       </w:pPr>
       <w:r>
-        <w:rPr>
-          <w:sz w:val="24"/>
-        </w:rPr>
         <w:t>2. Architecture</w:t>
       </w:r>
     </w:p>
     <w:p>
       <w:pPr>
-        <w:spacing w:after="120"/>
+        <w:spacing w:before="0" w:after="100" w:line="240" w:lineRule="auto"/>
       </w:pPr>
       <w:r>
-        <w:rPr>
-          <w:sz w:val="24"/>
-        </w:rPr>
         <w:t>3. Prerequisites</w:t>
       </w:r>
     </w:p>
     <w:p>
       <w:pPr>
-        <w:spacing w:after="120"/>
+        <w:spacing w:before="0" w:after="100" w:line="240" w:lineRule="auto"/>
       </w:pPr>
       <w:r>
-        <w:rPr>
-          <w:sz w:val="24"/>
-        </w:rPr>
         <w:t>4. Deployment Method A — Pure Terraform Workflow</w:t>
       </w:r>
     </w:p>
     <w:p>
       <w:pPr>
-        <w:spacing w:after="120"/>
+        <w:spacing w:before="0" w:after="100" w:line="240" w:lineRule="auto"/>
       </w:pPr>
       <w:r>
-        <w:rPr>
-          <w:sz w:val="24"/>
-        </w:rPr>
         <w:t>5. Deployment Method B — Interactive zsec Wrapper</w:t>
       </w:r>
     </w:p>
     <w:p>
       <w:pPr>
-        <w:spacing w:after="120"/>
+        <w:spacing w:before="0" w:after="100" w:line="240" w:lineRule="auto"/>
       </w:pPr>
       <w:r>
-        <w:rPr>
-          <w:sz w:val="24"/>
-        </w:rPr>
         <w:t>6. Variable Reference</w:t>
       </w:r>
     </w:p>
     <w:p>
       <w:pPr>
-        <w:spacing w:after="120"/>
+        <w:spacing w:before="0" w:after="100" w:line="240" w:lineRule="auto"/>
       </w:pPr>
       <w:r>
-        <w:rPr>
-          <w:sz w:val="24"/>
-        </w:rPr>
         <w:t>7. Verifying Your Deployment</w:t>
       </w:r>
     </w:p>
     <w:p>
       <w:pPr>
-        <w:spacing w:after="120"/>
+        <w:spacing w:before="0" w:after="100" w:line="240" w:lineRule="auto"/>
       </w:pPr>
       <w:r>
-        <w:rPr>
-          <w:sz w:val="24"/>
-        </w:rPr>
         <w:t>8. Tearing Down / Destroying Resources</w:t>
       </w:r>
     </w:p>
     <w:p>
       <w:pPr>
-        <w:spacing w:after="120"/>
+        <w:spacing w:before="0" w:after="100" w:line="240" w:lineRule="auto"/>
       </w:pPr>
       <w:r>
-        <w:rPr>
-          <w:sz w:val="24"/>
-        </w:rPr>
         <w:t>9. Troubleshooting</w:t>
       </w:r>
     </w:p>
     <w:p>
       <w:pPr>
-        <w:spacing w:after="120"/>
+        <w:spacing w:before="0" w:after="100" w:line="240" w:lineRule="auto"/>
       </w:pPr>
       <w:r>
-        <w:rPr>
-          <w:sz w:val="24"/>
-        </w:rPr>
         <w:t>10. Security Notes</w:t>
       </w:r>
     </w:p>
@@ -218,11 +236,17 @@
       </w:r>
     </w:p>
     <w:p>
+      <w:pPr>
+        <w:spacing w:before="0" w:after="160" w:line="276" w:lineRule="auto"/>
+      </w:pPr>
       <w:r>
         <w:t>This guide walks through deploying an AWS Zero Trust Gateway (ZTGW) and its associated AWS Gateway Load Balancer (GWLB) Endpoint using Terraform. The ZTGW is provisioned via the Zscaler REST API, and the GWLB Endpoint is created directly as native Terraform resources inside your existing AWS VPC.</w:t>
       </w:r>
     </w:p>
     <w:p>
+      <w:pPr>
+        <w:spacing w:before="0" w:after="160" w:line="276" w:lineRule="auto"/>
+      </w:pPr>
       <w:r>
         <w:t>Two supported deployment methods are provided, and you may choose whichever best fits your team's workflow:</w:t>
       </w:r>
@@ -255,9 +279,15 @@
         <w:t xml:space="preserve"> A guided, interactive command-line wizard prompts you for each required value and caches your configuration for repeat runs. Recommended for first-time or manual deployments.</w:t>
       </w:r>
     </w:p>
+    <w:p>
+      <w:pPr>
+        <w:spacing w:before="0" w:after="80" w:line="240" w:lineRule="auto"/>
+      </w:pPr>
+    </w:p>
     <w:tbl>
       <w:tblPr>
         <w:tblW w:type="auto" w:w="0"/>
+        <w:tblLayout w:type="autofit"/>
         <w:tblLook w:firstColumn="1" w:firstRow="1" w:lastColumn="0" w:lastRow="0" w:noHBand="0" w:noVBand="1" w:val="04A0"/>
       </w:tblPr>
       <w:tblGrid>
@@ -268,20 +298,29 @@
           <w:tcPr>
             <w:tcW w:type="dxa" w:w="8640"/>
             <w:shd w:fill="FFF4EF"/>
+            <w:tcMar>
+              <w:top w:w="70" w:type="dxa"/>
+              <w:bottom w:w="70" w:type="dxa"/>
+              <w:left w:w="120" w:type="dxa"/>
+              <w:right w:w="120" w:type="dxa"/>
+            </w:tcMar>
           </w:tcPr>
           <w:p>
+            <w:pPr>
+              <w:spacing w:before="0" w:after="0" w:line="276" w:lineRule="auto"/>
+            </w:pPr>
             <w:r>
               <w:rPr>
                 <w:b/>
                 <w:color w:val="E85C2E"/>
-                <w:sz w:val="21"/>
+                <w:sz w:val="20"/>
               </w:rPr>
               <w:t xml:space="preserve">Note:  </w:t>
             </w:r>
             <w:r>
               <w:rPr>
                 <w:color w:val="1A1A1A"/>
-                <w:sz w:val="21"/>
+                <w:sz w:val="20"/>
               </w:rPr>
               <w:t>Both methods produce the same end result and can be used interchangeably across different environments.</w:t>
             </w:r>
@@ -289,7 +328,11 @@
         </w:tc>
       </w:tr>
     </w:tbl>
-    <w:p/>
+    <w:p>
+      <w:pPr>
+        <w:spacing w:before="0" w:after="160" w:line="240" w:lineRule="auto"/>
+      </w:pPr>
+    </w:p>
     <w:p>
       <w:pPr>
         <w:pStyle w:val="Heading1"/>
@@ -299,6 +342,9 @@
       </w:r>
     </w:p>
     <w:p>
+      <w:pPr>
+        <w:spacing w:before="0" w:after="160" w:line="276" w:lineRule="auto"/>
+      </w:pPr>
       <w:r>
         <w:t>At a high level, the deployment flow is as follows:</w:t>
       </w:r>
@@ -351,10 +397,15 @@
         <w:t>Terraform creates a route in each subnet's route table, directing traffic to its corresponding GWLB Endpoint for inspection.</w:t>
       </w:r>
     </w:p>
-    <w:p/>
+    <w:p>
+      <w:pPr>
+        <w:spacing w:before="0" w:after="80" w:line="240" w:lineRule="auto"/>
+      </w:pPr>
+    </w:p>
     <w:tbl>
       <w:tblPr>
         <w:tblW w:type="auto" w:w="0"/>
+        <w:tblLayout w:type="autofit"/>
         <w:tblLook w:firstColumn="1" w:firstRow="1" w:lastColumn="0" w:lastRow="0" w:noHBand="0" w:noVBand="1" w:val="04A0"/>
       </w:tblPr>
       <w:tblGrid>
@@ -365,20 +416,29 @@
           <w:tcPr>
             <w:tcW w:type="dxa" w:w="8640"/>
             <w:shd w:fill="FFF4EF"/>
+            <w:tcMar>
+              <w:top w:w="70" w:type="dxa"/>
+              <w:bottom w:w="70" w:type="dxa"/>
+              <w:left w:w="120" w:type="dxa"/>
+              <w:right w:w="120" w:type="dxa"/>
+            </w:tcMar>
           </w:tcPr>
           <w:p>
+            <w:pPr>
+              <w:spacing w:before="0" w:after="0" w:line="276" w:lineRule="auto"/>
+            </w:pPr>
             <w:r>
               <w:rPr>
                 <w:b/>
                 <w:color w:val="E85C2E"/>
-                <w:sz w:val="21"/>
+                <w:sz w:val="20"/>
               </w:rPr>
               <w:t xml:space="preserve">Important:  </w:t>
             </w:r>
             <w:r>
               <w:rPr>
                 <w:color w:val="1A1A1A"/>
-                <w:sz w:val="21"/>
+                <w:sz w:val="20"/>
               </w:rPr>
               <w:t>AWS requires exactly one subnet per Gateway Load Balancer-type VPC Endpoint. If you provide subnets across two Availability Zones, two separate endpoints and two separate routes will be created — one per subnet — to support multi-AZ redundancy.</w:t>
             </w:r>
@@ -386,7 +446,11 @@
         </w:tc>
       </w:tr>
     </w:tbl>
-    <w:p/>
+    <w:p>
+      <w:pPr>
+        <w:spacing w:before="0" w:after="160" w:line="240" w:lineRule="auto"/>
+      </w:pPr>
+    </w:p>
     <w:p>
       <w:pPr>
         <w:pStyle w:val="Heading2"/>
@@ -400,6 +464,7 @@
         <w:tblStyle w:val="TableGrid"/>
         <w:tblW w:type="auto" w:w="0"/>
         <w:jc w:val="center"/>
+        <w:tblLayout w:type="autofit"/>
         <w:tblLook w:firstColumn="1" w:firstRow="1" w:lastColumn="0" w:lastRow="0" w:noHBand="0" w:noVBand="1" w:val="04A0"/>
       </w:tblPr>
       <w:tblGrid>
@@ -412,15 +477,24 @@
         <w:tc>
           <w:tcPr>
             <w:tcW w:type="dxa" w:w="1584"/>
+            <w:tcMar>
+              <w:top w:w="50" w:type="dxa"/>
+              <w:bottom w:w="50" w:type="dxa"/>
+              <w:left w:w="90" w:type="dxa"/>
+              <w:right w:w="90" w:type="dxa"/>
+            </w:tcMar>
             <w:shd w:fill="E85C2E"/>
           </w:tcPr>
           <w:p>
+            <w:pPr>
+              <w:spacing w:before="0" w:after="0" w:line="252" w:lineRule="auto"/>
+            </w:pPr>
             <w:r/>
             <w:r>
               <w:rPr>
                 <w:b/>
                 <w:color w:val="FFFFFF"/>
-                <w:sz w:val="20"/>
+                <w:sz w:val="19"/>
               </w:rPr>
               <w:t>Mode</w:t>
             </w:r>
@@ -429,15 +503,24 @@
         <w:tc>
           <w:tcPr>
             <w:tcW w:type="dxa" w:w="1584"/>
+            <w:tcMar>
+              <w:top w:w="50" w:type="dxa"/>
+              <w:bottom w:w="50" w:type="dxa"/>
+              <w:left w:w="90" w:type="dxa"/>
+              <w:right w:w="90" w:type="dxa"/>
+            </w:tcMar>
             <w:shd w:fill="E85C2E"/>
           </w:tcPr>
           <w:p>
+            <w:pPr>
+              <w:spacing w:before="0" w:after="0" w:line="252" w:lineRule="auto"/>
+            </w:pPr>
             <w:r/>
             <w:r>
               <w:rPr>
                 <w:b/>
                 <w:color w:val="FFFFFF"/>
-                <w:sz w:val="20"/>
+                <w:sz w:val="19"/>
               </w:rPr>
               <w:t>Create Gateway?</w:t>
             </w:r>
@@ -446,15 +529,24 @@
         <w:tc>
           <w:tcPr>
             <w:tcW w:type="dxa" w:w="1584"/>
+            <w:tcMar>
+              <w:top w:w="50" w:type="dxa"/>
+              <w:bottom w:w="50" w:type="dxa"/>
+              <w:left w:w="90" w:type="dxa"/>
+              <w:right w:w="90" w:type="dxa"/>
+            </w:tcMar>
             <w:shd w:fill="E85C2E"/>
           </w:tcPr>
           <w:p>
+            <w:pPr>
+              <w:spacing w:before="0" w:after="0" w:line="252" w:lineRule="auto"/>
+            </w:pPr>
             <w:r/>
             <w:r>
               <w:rPr>
                 <w:b/>
                 <w:color w:val="FFFFFF"/>
-                <w:sz w:val="20"/>
+                <w:sz w:val="19"/>
               </w:rPr>
               <w:t>Create Endpoint?</w:t>
             </w:r>
@@ -463,15 +555,24 @@
         <w:tc>
           <w:tcPr>
             <w:tcW w:type="dxa" w:w="4176"/>
+            <w:tcMar>
+              <w:top w:w="50" w:type="dxa"/>
+              <w:bottom w:w="50" w:type="dxa"/>
+              <w:left w:w="90" w:type="dxa"/>
+              <w:right w:w="90" w:type="dxa"/>
+            </w:tcMar>
             <w:shd w:fill="E85C2E"/>
           </w:tcPr>
           <w:p>
+            <w:pPr>
+              <w:spacing w:before="0" w:after="0" w:line="252" w:lineRule="auto"/>
+            </w:pPr>
             <w:r/>
             <w:r>
               <w:rPr>
                 <w:b/>
                 <w:color w:val="FFFFFF"/>
-                <w:sz w:val="20"/>
+                <w:sz w:val="19"/>
               </w:rPr>
               <w:t>Use Case</w:t>
             </w:r>
@@ -482,12 +583,21 @@
         <w:tc>
           <w:tcPr>
             <w:tcW w:type="dxa" w:w="1584"/>
+            <w:tcMar>
+              <w:top w:w="50" w:type="dxa"/>
+              <w:bottom w:w="50" w:type="dxa"/>
+              <w:left w:w="90" w:type="dxa"/>
+              <w:right w:w="90" w:type="dxa"/>
+            </w:tcMar>
           </w:tcPr>
           <w:p>
+            <w:pPr>
+              <w:spacing w:before="0" w:after="0" w:line="252" w:lineRule="auto"/>
+            </w:pPr>
             <w:r/>
             <w:r>
               <w:rPr>
-                <w:sz w:val="19"/>
+                <w:sz w:val="18"/>
               </w:rPr>
               <w:t>Full</w:t>
             </w:r>
@@ -496,12 +606,21 @@
         <w:tc>
           <w:tcPr>
             <w:tcW w:type="dxa" w:w="1584"/>
+            <w:tcMar>
+              <w:top w:w="50" w:type="dxa"/>
+              <w:bottom w:w="50" w:type="dxa"/>
+              <w:left w:w="90" w:type="dxa"/>
+              <w:right w:w="90" w:type="dxa"/>
+            </w:tcMar>
           </w:tcPr>
           <w:p>
+            <w:pPr>
+              <w:spacing w:before="0" w:after="0" w:line="252" w:lineRule="auto"/>
+            </w:pPr>
             <w:r/>
             <w:r>
               <w:rPr>
-                <w:sz w:val="19"/>
+                <w:sz w:val="18"/>
               </w:rPr>
               <w:t>Yes</w:t>
             </w:r>
@@ -510,12 +629,21 @@
         <w:tc>
           <w:tcPr>
             <w:tcW w:type="dxa" w:w="1584"/>
+            <w:tcMar>
+              <w:top w:w="50" w:type="dxa"/>
+              <w:bottom w:w="50" w:type="dxa"/>
+              <w:left w:w="90" w:type="dxa"/>
+              <w:right w:w="90" w:type="dxa"/>
+            </w:tcMar>
           </w:tcPr>
           <w:p>
+            <w:pPr>
+              <w:spacing w:before="0" w:after="0" w:line="252" w:lineRule="auto"/>
+            </w:pPr>
             <w:r/>
             <w:r>
               <w:rPr>
-                <w:sz w:val="19"/>
+                <w:sz w:val="18"/>
               </w:rPr>
               <w:t>Yes</w:t>
             </w:r>
@@ -524,12 +652,21 @@
         <w:tc>
           <w:tcPr>
             <w:tcW w:type="dxa" w:w="4176"/>
+            <w:tcMar>
+              <w:top w:w="50" w:type="dxa"/>
+              <w:bottom w:w="50" w:type="dxa"/>
+              <w:left w:w="90" w:type="dxa"/>
+              <w:right w:w="90" w:type="dxa"/>
+            </w:tcMar>
           </w:tcPr>
           <w:p>
+            <w:pPr>
+              <w:spacing w:before="0" w:after="0" w:line="252" w:lineRule="auto"/>
+            </w:pPr>
             <w:r/>
             <w:r>
               <w:rPr>
-                <w:sz w:val="19"/>
+                <w:sz w:val="18"/>
               </w:rPr>
               <w:t>Deploy everything in a single run (recommended for most customers)</w:t>
             </w:r>
@@ -540,12 +677,21 @@
         <w:tc>
           <w:tcPr>
             <w:tcW w:type="dxa" w:w="1584"/>
+            <w:tcMar>
+              <w:top w:w="50" w:type="dxa"/>
+              <w:bottom w:w="50" w:type="dxa"/>
+              <w:left w:w="90" w:type="dxa"/>
+              <w:right w:w="90" w:type="dxa"/>
+            </w:tcMar>
           </w:tcPr>
           <w:p>
+            <w:pPr>
+              <w:spacing w:before="0" w:after="0" w:line="252" w:lineRule="auto"/>
+            </w:pPr>
             <w:r/>
             <w:r>
               <w:rPr>
-                <w:sz w:val="19"/>
+                <w:sz w:val="18"/>
               </w:rPr>
               <w:t>Gateway-only</w:t>
             </w:r>
@@ -554,12 +700,21 @@
         <w:tc>
           <w:tcPr>
             <w:tcW w:type="dxa" w:w="1584"/>
+            <w:tcMar>
+              <w:top w:w="50" w:type="dxa"/>
+              <w:bottom w:w="50" w:type="dxa"/>
+              <w:left w:w="90" w:type="dxa"/>
+              <w:right w:w="90" w:type="dxa"/>
+            </w:tcMar>
           </w:tcPr>
           <w:p>
+            <w:pPr>
+              <w:spacing w:before="0" w:after="0" w:line="252" w:lineRule="auto"/>
+            </w:pPr>
             <w:r/>
             <w:r>
               <w:rPr>
-                <w:sz w:val="19"/>
+                <w:sz w:val="18"/>
               </w:rPr>
               <w:t>Yes</w:t>
             </w:r>
@@ -568,12 +723,21 @@
         <w:tc>
           <w:tcPr>
             <w:tcW w:type="dxa" w:w="1584"/>
+            <w:tcMar>
+              <w:top w:w="50" w:type="dxa"/>
+              <w:bottom w:w="50" w:type="dxa"/>
+              <w:left w:w="90" w:type="dxa"/>
+              <w:right w:w="90" w:type="dxa"/>
+            </w:tcMar>
           </w:tcPr>
           <w:p>
+            <w:pPr>
+              <w:spacing w:before="0" w:after="0" w:line="252" w:lineRule="auto"/>
+            </w:pPr>
             <w:r/>
             <w:r>
               <w:rPr>
-                <w:sz w:val="19"/>
+                <w:sz w:val="18"/>
               </w:rPr>
               <w:t>No</w:t>
             </w:r>
@@ -582,12 +746,21 @@
         <w:tc>
           <w:tcPr>
             <w:tcW w:type="dxa" w:w="4176"/>
+            <w:tcMar>
+              <w:top w:w="50" w:type="dxa"/>
+              <w:bottom w:w="50" w:type="dxa"/>
+              <w:left w:w="90" w:type="dxa"/>
+              <w:right w:w="90" w:type="dxa"/>
+            </w:tcMar>
           </w:tcPr>
           <w:p>
+            <w:pPr>
+              <w:spacing w:before="0" w:after="0" w:line="252" w:lineRule="auto"/>
+            </w:pPr>
             <w:r/>
             <w:r>
               <w:rPr>
-                <w:sz w:val="19"/>
+                <w:sz w:val="18"/>
               </w:rPr>
               <w:t>Create the gateway first; add endpoints in a later, separate run</w:t>
             </w:r>
@@ -598,12 +771,21 @@
         <w:tc>
           <w:tcPr>
             <w:tcW w:type="dxa" w:w="1584"/>
+            <w:tcMar>
+              <w:top w:w="50" w:type="dxa"/>
+              <w:bottom w:w="50" w:type="dxa"/>
+              <w:left w:w="90" w:type="dxa"/>
+              <w:right w:w="90" w:type="dxa"/>
+            </w:tcMar>
           </w:tcPr>
           <w:p>
+            <w:pPr>
+              <w:spacing w:before="0" w:after="0" w:line="252" w:lineRule="auto"/>
+            </w:pPr>
             <w:r/>
             <w:r>
               <w:rPr>
-                <w:sz w:val="19"/>
+                <w:sz w:val="18"/>
               </w:rPr>
               <w:t>Endpoint-only</w:t>
             </w:r>
@@ -612,12 +794,21 @@
         <w:tc>
           <w:tcPr>
             <w:tcW w:type="dxa" w:w="1584"/>
+            <w:tcMar>
+              <w:top w:w="50" w:type="dxa"/>
+              <w:bottom w:w="50" w:type="dxa"/>
+              <w:left w:w="90" w:type="dxa"/>
+              <w:right w:w="90" w:type="dxa"/>
+            </w:tcMar>
           </w:tcPr>
           <w:p>
+            <w:pPr>
+              <w:spacing w:before="0" w:after="0" w:line="252" w:lineRule="auto"/>
+            </w:pPr>
             <w:r/>
             <w:r>
               <w:rPr>
-                <w:sz w:val="19"/>
+                <w:sz w:val="18"/>
               </w:rPr>
               <w:t>No</w:t>
             </w:r>
@@ -626,12 +817,21 @@
         <w:tc>
           <w:tcPr>
             <w:tcW w:type="dxa" w:w="1584"/>
+            <w:tcMar>
+              <w:top w:w="50" w:type="dxa"/>
+              <w:bottom w:w="50" w:type="dxa"/>
+              <w:left w:w="90" w:type="dxa"/>
+              <w:right w:w="90" w:type="dxa"/>
+            </w:tcMar>
           </w:tcPr>
           <w:p>
+            <w:pPr>
+              <w:spacing w:before="0" w:after="0" w:line="252" w:lineRule="auto"/>
+            </w:pPr>
             <w:r/>
             <w:r>
               <w:rPr>
-                <w:sz w:val="19"/>
+                <w:sz w:val="18"/>
               </w:rPr>
               <w:t>Yes</w:t>
             </w:r>
@@ -640,12 +840,21 @@
         <w:tc>
           <w:tcPr>
             <w:tcW w:type="dxa" w:w="4176"/>
+            <w:tcMar>
+              <w:top w:w="50" w:type="dxa"/>
+              <w:bottom w:w="50" w:type="dxa"/>
+              <w:left w:w="90" w:type="dxa"/>
+              <w:right w:w="90" w:type="dxa"/>
+            </w:tcMar>
           </w:tcPr>
           <w:p>
+            <w:pPr>
+              <w:spacing w:before="0" w:after="0" w:line="252" w:lineRule="auto"/>
+            </w:pPr>
             <w:r/>
             <w:r>
               <w:rPr>
-                <w:sz w:val="19"/>
+                <w:sz w:val="18"/>
               </w:rPr>
               <w:t>Attach a new VPC/subnet to a gateway that already exists</w:t>
             </w:r>
@@ -653,11 +862,10 @@
         </w:tc>
       </w:tr>
     </w:tbl>
-    <w:p/>
     <w:p>
-      <w:r>
-        <w:br w:type="page"/>
-      </w:r>
+      <w:pPr>
+        <w:spacing w:before="0" w:after="200" w:line="240" w:lineRule="auto"/>
+      </w:pPr>
     </w:p>
     <w:p>
       <w:pPr>
@@ -668,6 +876,9 @@
       </w:r>
     </w:p>
     <w:p>
+      <w:pPr>
+        <w:spacing w:before="0" w:after="160" w:line="276" w:lineRule="auto"/>
+      </w:pPr>
       <w:r>
         <w:t>Before beginning, ensure the following are available:</w:t>
       </w:r>
@@ -677,6 +888,7 @@
         <w:tblStyle w:val="TableGrid"/>
         <w:tblW w:type="auto" w:w="0"/>
         <w:jc w:val="center"/>
+        <w:tblLayout w:type="autofit"/>
         <w:tblLook w:firstColumn="1" w:firstRow="1" w:lastColumn="0" w:lastRow="0" w:noHBand="0" w:noVBand="1" w:val="04A0"/>
       </w:tblPr>
       <w:tblGrid>
@@ -687,15 +899,24 @@
         <w:tc>
           <w:tcPr>
             <w:tcW w:type="dxa" w:w="3168"/>
+            <w:tcMar>
+              <w:top w:w="50" w:type="dxa"/>
+              <w:bottom w:w="50" w:type="dxa"/>
+              <w:left w:w="90" w:type="dxa"/>
+              <w:right w:w="90" w:type="dxa"/>
+            </w:tcMar>
             <w:shd w:fill="E85C2E"/>
           </w:tcPr>
           <w:p>
+            <w:pPr>
+              <w:spacing w:before="0" w:after="0" w:line="252" w:lineRule="auto"/>
+            </w:pPr>
             <w:r/>
             <w:r>
               <w:rPr>
                 <w:b/>
                 <w:color w:val="FFFFFF"/>
-                <w:sz w:val="20"/>
+                <w:sz w:val="19"/>
               </w:rPr>
               <w:t>Requirement</w:t>
             </w:r>
@@ -704,15 +925,24 @@
         <w:tc>
           <w:tcPr>
             <w:tcW w:type="dxa" w:w="5760"/>
+            <w:tcMar>
+              <w:top w:w="50" w:type="dxa"/>
+              <w:bottom w:w="50" w:type="dxa"/>
+              <w:left w:w="90" w:type="dxa"/>
+              <w:right w:w="90" w:type="dxa"/>
+            </w:tcMar>
             <w:shd w:fill="E85C2E"/>
           </w:tcPr>
           <w:p>
+            <w:pPr>
+              <w:spacing w:before="0" w:after="0" w:line="252" w:lineRule="auto"/>
+            </w:pPr>
             <w:r/>
             <w:r>
               <w:rPr>
                 <w:b/>
                 <w:color w:val="FFFFFF"/>
-                <w:sz w:val="20"/>
+                <w:sz w:val="19"/>
               </w:rPr>
               <w:t>Purpose</w:t>
             </w:r>
@@ -723,12 +953,21 @@
         <w:tc>
           <w:tcPr>
             <w:tcW w:type="dxa" w:w="3168"/>
+            <w:tcMar>
+              <w:top w:w="50" w:type="dxa"/>
+              <w:bottom w:w="50" w:type="dxa"/>
+              <w:left w:w="90" w:type="dxa"/>
+              <w:right w:w="90" w:type="dxa"/>
+            </w:tcMar>
           </w:tcPr>
           <w:p>
+            <w:pPr>
+              <w:spacing w:before="0" w:after="0" w:line="252" w:lineRule="auto"/>
+            </w:pPr>
             <w:r/>
             <w:r>
               <w:rPr>
-                <w:sz w:val="19"/>
+                <w:sz w:val="18"/>
               </w:rPr>
               <w:t>Terraform &gt;= 1.0</w:t>
             </w:r>
@@ -737,12 +976,21 @@
         <w:tc>
           <w:tcPr>
             <w:tcW w:type="dxa" w:w="5760"/>
+            <w:tcMar>
+              <w:top w:w="50" w:type="dxa"/>
+              <w:bottom w:w="50" w:type="dxa"/>
+              <w:left w:w="90" w:type="dxa"/>
+              <w:right w:w="90" w:type="dxa"/>
+            </w:tcMar>
           </w:tcPr>
           <w:p>
+            <w:pPr>
+              <w:spacing w:before="0" w:after="0" w:line="252" w:lineRule="auto"/>
+            </w:pPr>
             <w:r/>
             <w:r>
               <w:rPr>
-                <w:sz w:val="19"/>
+                <w:sz w:val="18"/>
               </w:rPr>
               <w:t>Infrastructure orchestration</w:t>
             </w:r>
@@ -753,12 +1001,21 @@
         <w:tc>
           <w:tcPr>
             <w:tcW w:type="dxa" w:w="3168"/>
+            <w:tcMar>
+              <w:top w:w="50" w:type="dxa"/>
+              <w:bottom w:w="50" w:type="dxa"/>
+              <w:left w:w="90" w:type="dxa"/>
+              <w:right w:w="90" w:type="dxa"/>
+            </w:tcMar>
           </w:tcPr>
           <w:p>
+            <w:pPr>
+              <w:spacing w:before="0" w:after="0" w:line="252" w:lineRule="auto"/>
+            </w:pPr>
             <w:r/>
             <w:r>
               <w:rPr>
-                <w:sz w:val="19"/>
+                <w:sz w:val="18"/>
               </w:rPr>
               <w:t>AWS CLI</w:t>
             </w:r>
@@ -767,12 +1024,21 @@
         <w:tc>
           <w:tcPr>
             <w:tcW w:type="dxa" w:w="5760"/>
+            <w:tcMar>
+              <w:top w:w="50" w:type="dxa"/>
+              <w:bottom w:w="50" w:type="dxa"/>
+              <w:left w:w="90" w:type="dxa"/>
+              <w:right w:w="90" w:type="dxa"/>
+            </w:tcMar>
           </w:tcPr>
           <w:p>
+            <w:pPr>
+              <w:spacing w:before="0" w:after="0" w:line="252" w:lineRule="auto"/>
+            </w:pPr>
             <w:r/>
             <w:r>
               <w:rPr>
-                <w:sz w:val="19"/>
+                <w:sz w:val="18"/>
               </w:rPr>
               <w:t>Availability Zone discovery; AWS credential configuration</w:t>
             </w:r>
@@ -783,12 +1049,21 @@
         <w:tc>
           <w:tcPr>
             <w:tcW w:type="dxa" w:w="3168"/>
+            <w:tcMar>
+              <w:top w:w="50" w:type="dxa"/>
+              <w:bottom w:w="50" w:type="dxa"/>
+              <w:left w:w="90" w:type="dxa"/>
+              <w:right w:w="90" w:type="dxa"/>
+            </w:tcMar>
           </w:tcPr>
           <w:p>
+            <w:pPr>
+              <w:spacing w:before="0" w:after="0" w:line="252" w:lineRule="auto"/>
+            </w:pPr>
             <w:r/>
             <w:r>
               <w:rPr>
-                <w:sz w:val="19"/>
+                <w:sz w:val="18"/>
               </w:rPr>
               <w:t>Python 3</w:t>
             </w:r>
@@ -797,12 +1072,21 @@
         <w:tc>
           <w:tcPr>
             <w:tcW w:type="dxa" w:w="5760"/>
+            <w:tcMar>
+              <w:top w:w="50" w:type="dxa"/>
+              <w:bottom w:w="50" w:type="dxa"/>
+              <w:left w:w="90" w:type="dxa"/>
+              <w:right w:w="90" w:type="dxa"/>
+            </w:tcMar>
           </w:tcPr>
           <w:p>
+            <w:pPr>
+              <w:spacing w:before="0" w:after="0" w:line="252" w:lineRule="auto"/>
+            </w:pPr>
             <w:r/>
             <w:r>
               <w:rPr>
-                <w:sz w:val="19"/>
+                <w:sz w:val="18"/>
               </w:rPr>
               <w:t>Used internally by deployment scripts for JSON processing</w:t>
             </w:r>
@@ -813,12 +1097,21 @@
         <w:tc>
           <w:tcPr>
             <w:tcW w:type="dxa" w:w="3168"/>
+            <w:tcMar>
+              <w:top w:w="50" w:type="dxa"/>
+              <w:bottom w:w="50" w:type="dxa"/>
+              <w:left w:w="90" w:type="dxa"/>
+              <w:right w:w="90" w:type="dxa"/>
+            </w:tcMar>
           </w:tcPr>
           <w:p>
+            <w:pPr>
+              <w:spacing w:before="0" w:after="0" w:line="252" w:lineRule="auto"/>
+            </w:pPr>
             <w:r/>
             <w:r>
               <w:rPr>
-                <w:sz w:val="19"/>
+                <w:sz w:val="18"/>
               </w:rPr>
               <w:t>Zscaler OneAPI Credentials</w:t>
             </w:r>
@@ -827,12 +1120,21 @@
         <w:tc>
           <w:tcPr>
             <w:tcW w:type="dxa" w:w="5760"/>
+            <w:tcMar>
+              <w:top w:w="50" w:type="dxa"/>
+              <w:bottom w:w="50" w:type="dxa"/>
+              <w:left w:w="90" w:type="dxa"/>
+              <w:right w:w="90" w:type="dxa"/>
+            </w:tcMar>
           </w:tcPr>
           <w:p>
+            <w:pPr>
+              <w:spacing w:before="0" w:after="0" w:line="252" w:lineRule="auto"/>
+            </w:pPr>
             <w:r/>
             <w:r>
               <w:rPr>
-                <w:sz w:val="19"/>
+                <w:sz w:val="18"/>
               </w:rPr>
               <w:t>Client ID, Client Secret, and Vanity Domain for your Zscaler tenant</w:t>
             </w:r>
@@ -843,12 +1145,21 @@
         <w:tc>
           <w:tcPr>
             <w:tcW w:type="dxa" w:w="3168"/>
+            <w:tcMar>
+              <w:top w:w="50" w:type="dxa"/>
+              <w:bottom w:w="50" w:type="dxa"/>
+              <w:left w:w="90" w:type="dxa"/>
+              <w:right w:w="90" w:type="dxa"/>
+            </w:tcMar>
           </w:tcPr>
           <w:p>
+            <w:pPr>
+              <w:spacing w:before="0" w:after="0" w:line="252" w:lineRule="auto"/>
+            </w:pPr>
             <w:r/>
             <w:r>
               <w:rPr>
-                <w:sz w:val="19"/>
+                <w:sz w:val="18"/>
               </w:rPr>
               <w:t>AWS Credentials</w:t>
             </w:r>
@@ -857,12 +1168,21 @@
         <w:tc>
           <w:tcPr>
             <w:tcW w:type="dxa" w:w="5760"/>
+            <w:tcMar>
+              <w:top w:w="50" w:type="dxa"/>
+              <w:bottom w:w="50" w:type="dxa"/>
+              <w:left w:w="90" w:type="dxa"/>
+              <w:right w:w="90" w:type="dxa"/>
+            </w:tcMar>
           </w:tcPr>
           <w:p>
+            <w:pPr>
+              <w:spacing w:before="0" w:after="0" w:line="252" w:lineRule="auto"/>
+            </w:pPr>
             <w:r/>
             <w:r>
               <w:rPr>
-                <w:sz w:val="19"/>
+                <w:sz w:val="18"/>
               </w:rPr>
               <w:t>Configured for the target AWS account (via profile, environment variables, or IAM role)</w:t>
             </w:r>
@@ -873,12 +1193,21 @@
         <w:tc>
           <w:tcPr>
             <w:tcW w:type="dxa" w:w="3168"/>
+            <w:tcMar>
+              <w:top w:w="50" w:type="dxa"/>
+              <w:bottom w:w="50" w:type="dxa"/>
+              <w:left w:w="90" w:type="dxa"/>
+              <w:right w:w="90" w:type="dxa"/>
+            </w:tcMar>
           </w:tcPr>
           <w:p>
+            <w:pPr>
+              <w:spacing w:before="0" w:after="0" w:line="252" w:lineRule="auto"/>
+            </w:pPr>
             <w:r/>
             <w:r>
               <w:rPr>
-                <w:sz w:val="19"/>
+                <w:sz w:val="18"/>
               </w:rPr>
               <w:t>Existing VPC and Subnets</w:t>
             </w:r>
@@ -887,12 +1216,21 @@
         <w:tc>
           <w:tcPr>
             <w:tcW w:type="dxa" w:w="5760"/>
+            <w:tcMar>
+              <w:top w:w="50" w:type="dxa"/>
+              <w:bottom w:w="50" w:type="dxa"/>
+              <w:left w:w="90" w:type="dxa"/>
+              <w:right w:w="90" w:type="dxa"/>
+            </w:tcMar>
           </w:tcPr>
           <w:p>
+            <w:pPr>
+              <w:spacing w:before="0" w:after="0" w:line="252" w:lineRule="auto"/>
+            </w:pPr>
             <w:r/>
             <w:r>
               <w:rPr>
-                <w:sz w:val="19"/>
+                <w:sz w:val="18"/>
               </w:rPr>
               <w:t>At least one subnet per Availability Zone where the GWLB Endpoint(s) will be created</w:t>
             </w:r>
@@ -900,7 +1238,11 @@
         </w:tc>
       </w:tr>
     </w:tbl>
-    <w:p/>
+    <w:p>
+      <w:pPr>
+        <w:spacing w:before="0" w:after="200" w:line="240" w:lineRule="auto"/>
+      </w:pPr>
+    </w:p>
     <w:p>
       <w:pPr>
         <w:pStyle w:val="Heading2"/>
@@ -910,6 +1252,9 @@
       </w:r>
     </w:p>
     <w:p>
+      <w:pPr>
+        <w:spacing w:before="0" w:after="160" w:line="276" w:lineRule="auto"/>
+      </w:pPr>
       <w:r>
         <w:t>The AWS credentials used must be able to perform the following actions:</w:t>
       </w:r>
@@ -979,11 +1324,6 @@
       </w:r>
     </w:p>
     <w:p>
-      <w:r>
-        <w:br w:type="page"/>
-      </w:r>
-    </w:p>
-    <w:p>
       <w:pPr>
         <w:pStyle w:val="Heading1"/>
       </w:pPr>
@@ -992,6 +1332,9 @@
       </w:r>
     </w:p>
     <w:p>
+      <w:pPr>
+        <w:spacing w:before="0" w:after="160" w:line="276" w:lineRule="auto"/>
+      </w:pPr>
       <w:r>
         <w:t>This method drives the entire deployment through a single Terraform configuration file and a single terraform apply command.</w:t>
       </w:r>
@@ -1008,6 +1351,7 @@
       <w:tblPr>
         <w:tblW w:type="auto" w:w="0"/>
         <w:jc w:val="left"/>
+        <w:tblLayout w:type="autofit"/>
         <w:tblLook w:firstColumn="1" w:firstRow="1" w:lastColumn="0" w:lastRow="0" w:noHBand="0" w:noVBand="1" w:val="04A0"/>
       </w:tblPr>
       <w:tblGrid>
@@ -1018,10 +1362,16 @@
           <w:tcPr>
             <w:tcW w:type="dxa" w:w="8640"/>
             <w:shd w:fill="2D2D2D"/>
+            <w:tcMar>
+              <w:top w:w="80" w:type="dxa"/>
+              <w:bottom w:w="80" w:type="dxa"/>
+              <w:left w:w="120" w:type="dxa"/>
+              <w:right w:w="120" w:type="dxa"/>
+            </w:tcMar>
           </w:tcPr>
           <w:p>
             <w:pPr>
-              <w:spacing w:after="0" w:before="0"/>
+              <w:spacing w:before="0" w:after="0" w:line="240" w:lineRule="auto"/>
             </w:pPr>
             <w:r/>
             <w:r>
@@ -1035,7 +1385,7 @@
           </w:p>
           <w:p>
             <w:pPr>
-              <w:spacing w:after="0" w:before="0"/>
+              <w:spacing w:before="0" w:after="0" w:line="240" w:lineRule="auto"/>
             </w:pPr>
             <w:r>
               <w:rPr>
@@ -1049,7 +1399,11 @@
         </w:tc>
       </w:tr>
     </w:tbl>
-    <w:p/>
+    <w:p>
+      <w:pPr>
+        <w:spacing w:before="0" w:after="160" w:line="240" w:lineRule="auto"/>
+      </w:pPr>
+    </w:p>
     <w:p>
       <w:pPr>
         <w:pStyle w:val="Heading2"/>
@@ -1059,6 +1413,9 @@
       </w:r>
     </w:p>
     <w:p>
+      <w:pPr>
+        <w:spacing w:before="0" w:after="160" w:line="276" w:lineRule="auto"/>
+      </w:pPr>
       <w:r>
         <w:t>Copy the example configuration file and fill in your real values. Never commit the resulting file to version control — it will contain sensitive credentials.</w:t>
       </w:r>
@@ -1067,6 +1424,7 @@
       <w:tblPr>
         <w:tblW w:type="auto" w:w="0"/>
         <w:jc w:val="left"/>
+        <w:tblLayout w:type="autofit"/>
         <w:tblLook w:firstColumn="1" w:firstRow="1" w:lastColumn="0" w:lastRow="0" w:noHBand="0" w:noVBand="1" w:val="04A0"/>
       </w:tblPr>
       <w:tblGrid>
@@ -1077,10 +1435,16 @@
           <w:tcPr>
             <w:tcW w:type="dxa" w:w="8640"/>
             <w:shd w:fill="2D2D2D"/>
+            <w:tcMar>
+              <w:top w:w="80" w:type="dxa"/>
+              <w:bottom w:w="80" w:type="dxa"/>
+              <w:left w:w="120" w:type="dxa"/>
+              <w:right w:w="120" w:type="dxa"/>
+            </w:tcMar>
           </w:tcPr>
           <w:p>
             <w:pPr>
-              <w:spacing w:after="0" w:before="0"/>
+              <w:spacing w:before="0" w:after="0" w:line="240" w:lineRule="auto"/>
             </w:pPr>
             <w:r/>
             <w:r>
@@ -1095,8 +1459,15 @@
         </w:tc>
       </w:tr>
     </w:tbl>
-    <w:p/>
     <w:p>
+      <w:pPr>
+        <w:spacing w:before="0" w:after="160" w:line="240" w:lineRule="auto"/>
+      </w:pPr>
+    </w:p>
+    <w:p>
+      <w:pPr>
+        <w:spacing w:before="0" w:after="160" w:line="276" w:lineRule="auto"/>
+      </w:pPr>
       <w:r>
         <w:t>Edit ztgw-full-deploy.tfvars and supply the following:</w:t>
       </w:r>
@@ -1153,6 +1524,7 @@
       <w:tblPr>
         <w:tblW w:type="auto" w:w="0"/>
         <w:jc w:val="left"/>
+        <w:tblLayout w:type="autofit"/>
         <w:tblLook w:firstColumn="1" w:firstRow="1" w:lastColumn="0" w:lastRow="0" w:noHBand="0" w:noVBand="1" w:val="04A0"/>
       </w:tblPr>
       <w:tblGrid>
@@ -1163,10 +1535,16 @@
           <w:tcPr>
             <w:tcW w:type="dxa" w:w="8640"/>
             <w:shd w:fill="2D2D2D"/>
+            <w:tcMar>
+              <w:top w:w="80" w:type="dxa"/>
+              <w:bottom w:w="80" w:type="dxa"/>
+              <w:left w:w="120" w:type="dxa"/>
+              <w:right w:w="120" w:type="dxa"/>
+            </w:tcMar>
           </w:tcPr>
           <w:p>
             <w:pPr>
-              <w:spacing w:after="0" w:before="0"/>
+              <w:spacing w:before="0" w:after="0" w:line="240" w:lineRule="auto"/>
             </w:pPr>
             <w:r/>
             <w:r>
@@ -1181,7 +1559,11 @@
         </w:tc>
       </w:tr>
     </w:tbl>
-    <w:p/>
+    <w:p>
+      <w:pPr>
+        <w:spacing w:before="0" w:after="160" w:line="240" w:lineRule="auto"/>
+      </w:pPr>
+    </w:p>
     <w:p>
       <w:pPr>
         <w:pStyle w:val="Heading2"/>
@@ -1194,6 +1576,7 @@
       <w:tblPr>
         <w:tblW w:type="auto" w:w="0"/>
         <w:jc w:val="left"/>
+        <w:tblLayout w:type="autofit"/>
         <w:tblLook w:firstColumn="1" w:firstRow="1" w:lastColumn="0" w:lastRow="0" w:noHBand="0" w:noVBand="1" w:val="04A0"/>
       </w:tblPr>
       <w:tblGrid>
@@ -1204,10 +1587,16 @@
           <w:tcPr>
             <w:tcW w:type="dxa" w:w="8640"/>
             <w:shd w:fill="2D2D2D"/>
+            <w:tcMar>
+              <w:top w:w="80" w:type="dxa"/>
+              <w:bottom w:w="80" w:type="dxa"/>
+              <w:left w:w="120" w:type="dxa"/>
+              <w:right w:w="120" w:type="dxa"/>
+            </w:tcMar>
           </w:tcPr>
           <w:p>
             <w:pPr>
-              <w:spacing w:after="0" w:before="0"/>
+              <w:spacing w:before="0" w:after="0" w:line="240" w:lineRule="auto"/>
             </w:pPr>
             <w:r/>
             <w:r>
@@ -1222,7 +1611,11 @@
         </w:tc>
       </w:tr>
     </w:tbl>
-    <w:p/>
+    <w:p>
+      <w:pPr>
+        <w:spacing w:before="0" w:after="160" w:line="240" w:lineRule="auto"/>
+      </w:pPr>
+    </w:p>
     <w:p>
       <w:pPr>
         <w:pStyle w:val="Heading2"/>
@@ -1235,6 +1628,7 @@
       <w:tblPr>
         <w:tblW w:type="auto" w:w="0"/>
         <w:jc w:val="left"/>
+        <w:tblLayout w:type="autofit"/>
         <w:tblLook w:firstColumn="1" w:firstRow="1" w:lastColumn="0" w:lastRow="0" w:noHBand="0" w:noVBand="1" w:val="04A0"/>
       </w:tblPr>
       <w:tblGrid>
@@ -1245,10 +1639,16 @@
           <w:tcPr>
             <w:tcW w:type="dxa" w:w="8640"/>
             <w:shd w:fill="2D2D2D"/>
+            <w:tcMar>
+              <w:top w:w="80" w:type="dxa"/>
+              <w:bottom w:w="80" w:type="dxa"/>
+              <w:left w:w="120" w:type="dxa"/>
+              <w:right w:w="120" w:type="dxa"/>
+            </w:tcMar>
           </w:tcPr>
           <w:p>
             <w:pPr>
-              <w:spacing w:after="0" w:before="0"/>
+              <w:spacing w:before="0" w:after="0" w:line="240" w:lineRule="auto"/>
             </w:pPr>
             <w:r/>
             <w:r>
@@ -1263,8 +1663,15 @@
         </w:tc>
       </w:tr>
     </w:tbl>
-    <w:p/>
     <w:p>
+      <w:pPr>
+        <w:spacing w:before="0" w:after="160" w:line="240" w:lineRule="auto"/>
+      </w:pPr>
+    </w:p>
+    <w:p>
+      <w:pPr>
+        <w:spacing w:before="0" w:after="160" w:line="276" w:lineRule="auto"/>
+      </w:pPr>
       <w:r>
         <w:t>Terraform will prompt for confirmation before proceeding. Type yes to continue. The deployment will then:</w:t>
       </w:r>
@@ -1301,9 +1708,15 @@
         <w:t>Create the corresponding route(s) in each subnet's route table</w:t>
       </w:r>
     </w:p>
+    <w:p>
+      <w:pPr>
+        <w:spacing w:before="0" w:after="80" w:line="240" w:lineRule="auto"/>
+      </w:pPr>
+    </w:p>
     <w:tbl>
       <w:tblPr>
         <w:tblW w:type="auto" w:w="0"/>
+        <w:tblLayout w:type="autofit"/>
         <w:tblLook w:firstColumn="1" w:firstRow="1" w:lastColumn="0" w:lastRow="0" w:noHBand="0" w:noVBand="1" w:val="04A0"/>
       </w:tblPr>
       <w:tblGrid>
@@ -1314,20 +1727,29 @@
           <w:tcPr>
             <w:tcW w:type="dxa" w:w="8640"/>
             <w:shd w:fill="FFF4EF"/>
+            <w:tcMar>
+              <w:top w:w="70" w:type="dxa"/>
+              <w:bottom w:w="70" w:type="dxa"/>
+              <w:left w:w="120" w:type="dxa"/>
+              <w:right w:w="120" w:type="dxa"/>
+            </w:tcMar>
           </w:tcPr>
           <w:p>
+            <w:pPr>
+              <w:spacing w:before="0" w:after="0" w:line="276" w:lineRule="auto"/>
+            </w:pPr>
             <w:r>
               <w:rPr>
                 <w:b/>
                 <w:color w:val="E85C2E"/>
-                <w:sz w:val="21"/>
+                <w:sz w:val="20"/>
               </w:rPr>
               <w:t xml:space="preserve">Please be patient:  </w:t>
             </w:r>
             <w:r>
               <w:rPr>
                 <w:color w:val="1A1A1A"/>
-                <w:sz w:val="21"/>
+                <w:sz w:val="20"/>
               </w:rPr>
               <w:t>Gateway provisioning can take several minutes. Progress is printed to your terminal throughout.</w:t>
             </w:r>
@@ -1335,7 +1757,11 @@
         </w:tc>
       </w:tr>
     </w:tbl>
-    <w:p/>
+    <w:p>
+      <w:pPr>
+        <w:spacing w:before="0" w:after="160" w:line="240" w:lineRule="auto"/>
+      </w:pPr>
+    </w:p>
     <w:p>
       <w:pPr>
         <w:pStyle w:val="Heading2"/>
@@ -1345,6 +1771,9 @@
       </w:r>
     </w:p>
     <w:p>
+      <w:pPr>
+        <w:spacing w:before="0" w:after="160" w:line="276" w:lineRule="auto"/>
+      </w:pPr>
       <w:r>
         <w:t>Upon successful completion, Terraform will display outputs including the gateway ID, health status, and VPC Endpoint details. You may retrieve these at any time with:</w:t>
       </w:r>
@@ -1353,6 +1782,7 @@
       <w:tblPr>
         <w:tblW w:type="auto" w:w="0"/>
         <w:jc w:val="left"/>
+        <w:tblLayout w:type="autofit"/>
         <w:tblLook w:firstColumn="1" w:firstRow="1" w:lastColumn="0" w:lastRow="0" w:noHBand="0" w:noVBand="1" w:val="04A0"/>
       </w:tblPr>
       <w:tblGrid>
@@ -1363,10 +1793,16 @@
           <w:tcPr>
             <w:tcW w:type="dxa" w:w="8640"/>
             <w:shd w:fill="2D2D2D"/>
+            <w:tcMar>
+              <w:top w:w="80" w:type="dxa"/>
+              <w:bottom w:w="80" w:type="dxa"/>
+              <w:left w:w="120" w:type="dxa"/>
+              <w:right w:w="120" w:type="dxa"/>
+            </w:tcMar>
           </w:tcPr>
           <w:p>
             <w:pPr>
-              <w:spacing w:after="0" w:before="0"/>
+              <w:spacing w:before="0" w:after="0" w:line="240" w:lineRule="auto"/>
             </w:pPr>
             <w:r/>
             <w:r>
@@ -1381,11 +1817,10 @@
         </w:tc>
       </w:tr>
     </w:tbl>
-    <w:p/>
     <w:p>
-      <w:r>
-        <w:br w:type="page"/>
-      </w:r>
+      <w:pPr>
+        <w:spacing w:before="0" w:after="160" w:line="240" w:lineRule="auto"/>
+      </w:pPr>
     </w:p>
     <w:p>
       <w:pPr>
@@ -1396,6 +1831,9 @@
       </w:r>
     </w:p>
     <w:p>
+      <w:pPr>
+        <w:spacing w:before="0" w:after="160" w:line="276" w:lineRule="auto"/>
+      </w:pPr>
       <w:r>
         <w:t>This method uses a guided command-line wizard that prompts for each required value, making it well suited for first-time or manual deployments.</w:t>
       </w:r>
@@ -1412,6 +1850,7 @@
       <w:tblPr>
         <w:tblW w:type="auto" w:w="0"/>
         <w:jc w:val="left"/>
+        <w:tblLayout w:type="autofit"/>
         <w:tblLook w:firstColumn="1" w:firstRow="1" w:lastColumn="0" w:lastRow="0" w:noHBand="0" w:noVBand="1" w:val="04A0"/>
       </w:tblPr>
       <w:tblGrid>
@@ -1422,10 +1861,16 @@
           <w:tcPr>
             <w:tcW w:type="dxa" w:w="8640"/>
             <w:shd w:fill="2D2D2D"/>
+            <w:tcMar>
+              <w:top w:w="80" w:type="dxa"/>
+              <w:bottom w:w="80" w:type="dxa"/>
+              <w:left w:w="120" w:type="dxa"/>
+              <w:right w:w="120" w:type="dxa"/>
+            </w:tcMar>
           </w:tcPr>
           <w:p>
             <w:pPr>
-              <w:spacing w:after="0" w:before="0"/>
+              <w:spacing w:before="0" w:after="0" w:line="240" w:lineRule="auto"/>
             </w:pPr>
             <w:r/>
             <w:r>
@@ -1439,7 +1884,7 @@
           </w:p>
           <w:p>
             <w:pPr>
-              <w:spacing w:after="0" w:before="0"/>
+              <w:spacing w:before="0" w:after="0" w:line="240" w:lineRule="auto"/>
             </w:pPr>
             <w:r>
               <w:rPr>
@@ -1453,7 +1898,11 @@
         </w:tc>
       </w:tr>
     </w:tbl>
-    <w:p/>
+    <w:p>
+      <w:pPr>
+        <w:spacing w:before="0" w:after="160" w:line="240" w:lineRule="auto"/>
+      </w:pPr>
+    </w:p>
     <w:p>
       <w:pPr>
         <w:pStyle w:val="Heading2"/>
@@ -1466,6 +1915,7 @@
       <w:tblPr>
         <w:tblW w:type="auto" w:w="0"/>
         <w:jc w:val="left"/>
+        <w:tblLayout w:type="autofit"/>
         <w:tblLook w:firstColumn="1" w:firstRow="1" w:lastColumn="0" w:lastRow="0" w:noHBand="0" w:noVBand="1" w:val="04A0"/>
       </w:tblPr>
       <w:tblGrid>
@@ -1476,10 +1926,16 @@
           <w:tcPr>
             <w:tcW w:type="dxa" w:w="8640"/>
             <w:shd w:fill="2D2D2D"/>
+            <w:tcMar>
+              <w:top w:w="80" w:type="dxa"/>
+              <w:bottom w:w="80" w:type="dxa"/>
+              <w:left w:w="120" w:type="dxa"/>
+              <w:right w:w="120" w:type="dxa"/>
+            </w:tcMar>
           </w:tcPr>
           <w:p>
             <w:pPr>
-              <w:spacing w:after="0" w:before="0"/>
+              <w:spacing w:before="0" w:after="0" w:line="240" w:lineRule="auto"/>
             </w:pPr>
             <w:r/>
             <w:r>
@@ -1494,8 +1950,15 @@
         </w:tc>
       </w:tr>
     </w:tbl>
-    <w:p/>
     <w:p>
+      <w:pPr>
+        <w:spacing w:before="0" w:after="160" w:line="240" w:lineRule="auto"/>
+      </w:pPr>
+    </w:p>
+    <w:p>
+      <w:pPr>
+        <w:spacing w:before="0" w:after="160" w:line="276" w:lineRule="auto"/>
+      </w:pPr>
       <w:r>
         <w:t>On first run, you will be prompted for:</w:t>
       </w:r>
@@ -1541,6 +2004,9 @@
       </w:r>
     </w:p>
     <w:p>
+      <w:pPr>
+        <w:spacing w:before="0" w:after="160" w:line="276" w:lineRule="auto"/>
+      </w:pPr>
       <w:r>
         <w:t>Your responses are cached in a local configuration file so that re-running ./zsec up in the future will skip the prompts and redeploy using the same values.</w:t>
       </w:r>
@@ -1554,13 +2020,11 @@
       </w:r>
     </w:p>
     <w:p>
+      <w:pPr>
+        <w:spacing w:before="0" w:after="160" w:line="276" w:lineRule="auto"/>
+      </w:pPr>
       <w:r>
         <w:t>The wizard will create the gateway, wait for it to become healthy, and then run Terraform automatically to create the VPC Endpoint(s) and routes — all within the same command.</w:t>
-      </w:r>
-    </w:p>
-    <w:p>
-      <w:r>
-        <w:br w:type="page"/>
       </w:r>
     </w:p>
     <w:p>
@@ -1584,6 +2048,7 @@
         <w:tblStyle w:val="TableGrid"/>
         <w:tblW w:type="auto" w:w="0"/>
         <w:jc w:val="center"/>
+        <w:tblLayout w:type="autofit"/>
         <w:tblLook w:firstColumn="1" w:firstRow="1" w:lastColumn="0" w:lastRow="0" w:noHBand="0" w:noVBand="1" w:val="04A0"/>
       </w:tblPr>
       <w:tblGrid>
@@ -1595,15 +2060,24 @@
         <w:tc>
           <w:tcPr>
             <w:tcW w:type="dxa" w:w="2592"/>
+            <w:tcMar>
+              <w:top w:w="50" w:type="dxa"/>
+              <w:bottom w:w="50" w:type="dxa"/>
+              <w:left w:w="90" w:type="dxa"/>
+              <w:right w:w="90" w:type="dxa"/>
+            </w:tcMar>
             <w:shd w:fill="E85C2E"/>
           </w:tcPr>
           <w:p>
+            <w:pPr>
+              <w:spacing w:before="0" w:after="0" w:line="252" w:lineRule="auto"/>
+            </w:pPr>
             <w:r/>
             <w:r>
               <w:rPr>
                 <w:b/>
                 <w:color w:val="FFFFFF"/>
-                <w:sz w:val="20"/>
+                <w:sz w:val="19"/>
               </w:rPr>
               <w:t>Variable</w:t>
             </w:r>
@@ -1612,15 +2086,24 @@
         <w:tc>
           <w:tcPr>
             <w:tcW w:type="dxa" w:w="1440"/>
+            <w:tcMar>
+              <w:top w:w="50" w:type="dxa"/>
+              <w:bottom w:w="50" w:type="dxa"/>
+              <w:left w:w="90" w:type="dxa"/>
+              <w:right w:w="90" w:type="dxa"/>
+            </w:tcMar>
             <w:shd w:fill="E85C2E"/>
           </w:tcPr>
           <w:p>
+            <w:pPr>
+              <w:spacing w:before="0" w:after="0" w:line="252" w:lineRule="auto"/>
+            </w:pPr>
             <w:r/>
             <w:r>
               <w:rPr>
                 <w:b/>
                 <w:color w:val="FFFFFF"/>
-                <w:sz w:val="20"/>
+                <w:sz w:val="19"/>
               </w:rPr>
               <w:t>Required</w:t>
             </w:r>
@@ -1629,15 +2112,24 @@
         <w:tc>
           <w:tcPr>
             <w:tcW w:type="dxa" w:w="4896"/>
+            <w:tcMar>
+              <w:top w:w="50" w:type="dxa"/>
+              <w:bottom w:w="50" w:type="dxa"/>
+              <w:left w:w="90" w:type="dxa"/>
+              <w:right w:w="90" w:type="dxa"/>
+            </w:tcMar>
             <w:shd w:fill="E85C2E"/>
           </w:tcPr>
           <w:p>
+            <w:pPr>
+              <w:spacing w:before="0" w:after="0" w:line="252" w:lineRule="auto"/>
+            </w:pPr>
             <w:r/>
             <w:r>
               <w:rPr>
                 <w:b/>
                 <w:color w:val="FFFFFF"/>
-                <w:sz w:val="20"/>
+                <w:sz w:val="19"/>
               </w:rPr>
               <w:t>Description</w:t>
             </w:r>
@@ -1648,12 +2140,21 @@
         <w:tc>
           <w:tcPr>
             <w:tcW w:type="dxa" w:w="2592"/>
+            <w:tcMar>
+              <w:top w:w="50" w:type="dxa"/>
+              <w:bottom w:w="50" w:type="dxa"/>
+              <w:left w:w="90" w:type="dxa"/>
+              <w:right w:w="90" w:type="dxa"/>
+            </w:tcMar>
           </w:tcPr>
           <w:p>
+            <w:pPr>
+              <w:spacing w:before="0" w:after="0" w:line="252" w:lineRule="auto"/>
+            </w:pPr>
             <w:r/>
             <w:r>
               <w:rPr>
-                <w:sz w:val="19"/>
+                <w:sz w:val="18"/>
               </w:rPr>
               <w:t>client_id</w:t>
             </w:r>
@@ -1662,12 +2163,21 @@
         <w:tc>
           <w:tcPr>
             <w:tcW w:type="dxa" w:w="1440"/>
+            <w:tcMar>
+              <w:top w:w="50" w:type="dxa"/>
+              <w:bottom w:w="50" w:type="dxa"/>
+              <w:left w:w="90" w:type="dxa"/>
+              <w:right w:w="90" w:type="dxa"/>
+            </w:tcMar>
           </w:tcPr>
           <w:p>
+            <w:pPr>
+              <w:spacing w:before="0" w:after="0" w:line="252" w:lineRule="auto"/>
+            </w:pPr>
             <w:r/>
             <w:r>
               <w:rPr>
-                <w:sz w:val="19"/>
+                <w:sz w:val="18"/>
               </w:rPr>
               <w:t>Yes</w:t>
             </w:r>
@@ -1676,12 +2186,21 @@
         <w:tc>
           <w:tcPr>
             <w:tcW w:type="dxa" w:w="4896"/>
+            <w:tcMar>
+              <w:top w:w="50" w:type="dxa"/>
+              <w:bottom w:w="50" w:type="dxa"/>
+              <w:left w:w="90" w:type="dxa"/>
+              <w:right w:w="90" w:type="dxa"/>
+            </w:tcMar>
           </w:tcPr>
           <w:p>
+            <w:pPr>
+              <w:spacing w:before="0" w:after="0" w:line="252" w:lineRule="auto"/>
+            </w:pPr>
             <w:r/>
             <w:r>
               <w:rPr>
-                <w:sz w:val="19"/>
+                <w:sz w:val="18"/>
               </w:rPr>
               <w:t>Zscaler OneAPI OAuth2 client ID</w:t>
             </w:r>
@@ -1692,12 +2211,21 @@
         <w:tc>
           <w:tcPr>
             <w:tcW w:type="dxa" w:w="2592"/>
+            <w:tcMar>
+              <w:top w:w="50" w:type="dxa"/>
+              <w:bottom w:w="50" w:type="dxa"/>
+              <w:left w:w="90" w:type="dxa"/>
+              <w:right w:w="90" w:type="dxa"/>
+            </w:tcMar>
           </w:tcPr>
           <w:p>
+            <w:pPr>
+              <w:spacing w:before="0" w:after="0" w:line="252" w:lineRule="auto"/>
+            </w:pPr>
             <w:r/>
             <w:r>
               <w:rPr>
-                <w:sz w:val="19"/>
+                <w:sz w:val="18"/>
               </w:rPr>
               <w:t>client_secret</w:t>
             </w:r>
@@ -1706,12 +2234,21 @@
         <w:tc>
           <w:tcPr>
             <w:tcW w:type="dxa" w:w="1440"/>
+            <w:tcMar>
+              <w:top w:w="50" w:type="dxa"/>
+              <w:bottom w:w="50" w:type="dxa"/>
+              <w:left w:w="90" w:type="dxa"/>
+              <w:right w:w="90" w:type="dxa"/>
+            </w:tcMar>
           </w:tcPr>
           <w:p>
+            <w:pPr>
+              <w:spacing w:before="0" w:after="0" w:line="252" w:lineRule="auto"/>
+            </w:pPr>
             <w:r/>
             <w:r>
               <w:rPr>
-                <w:sz w:val="19"/>
+                <w:sz w:val="18"/>
               </w:rPr>
               <w:t>Yes</w:t>
             </w:r>
@@ -1720,12 +2257,21 @@
         <w:tc>
           <w:tcPr>
             <w:tcW w:type="dxa" w:w="4896"/>
+            <w:tcMar>
+              <w:top w:w="50" w:type="dxa"/>
+              <w:bottom w:w="50" w:type="dxa"/>
+              <w:left w:w="90" w:type="dxa"/>
+              <w:right w:w="90" w:type="dxa"/>
+            </w:tcMar>
           </w:tcPr>
           <w:p>
+            <w:pPr>
+              <w:spacing w:before="0" w:after="0" w:line="252" w:lineRule="auto"/>
+            </w:pPr>
             <w:r/>
             <w:r>
               <w:rPr>
-                <w:sz w:val="19"/>
+                <w:sz w:val="18"/>
               </w:rPr>
               <w:t>Zscaler OneAPI OAuth2 client secret</w:t>
             </w:r>
@@ -1736,12 +2282,21 @@
         <w:tc>
           <w:tcPr>
             <w:tcW w:type="dxa" w:w="2592"/>
+            <w:tcMar>
+              <w:top w:w="50" w:type="dxa"/>
+              <w:bottom w:w="50" w:type="dxa"/>
+              <w:left w:w="90" w:type="dxa"/>
+              <w:right w:w="90" w:type="dxa"/>
+            </w:tcMar>
           </w:tcPr>
           <w:p>
+            <w:pPr>
+              <w:spacing w:before="0" w:after="0" w:line="252" w:lineRule="auto"/>
+            </w:pPr>
             <w:r/>
             <w:r>
               <w:rPr>
-                <w:sz w:val="19"/>
+                <w:sz w:val="18"/>
               </w:rPr>
               <w:t>vanity_domain</w:t>
             </w:r>
@@ -1750,12 +2305,21 @@
         <w:tc>
           <w:tcPr>
             <w:tcW w:type="dxa" w:w="1440"/>
+            <w:tcMar>
+              <w:top w:w="50" w:type="dxa"/>
+              <w:bottom w:w="50" w:type="dxa"/>
+              <w:left w:w="90" w:type="dxa"/>
+              <w:right w:w="90" w:type="dxa"/>
+            </w:tcMar>
           </w:tcPr>
           <w:p>
+            <w:pPr>
+              <w:spacing w:before="0" w:after="0" w:line="252" w:lineRule="auto"/>
+            </w:pPr>
             <w:r/>
             <w:r>
               <w:rPr>
-                <w:sz w:val="19"/>
+                <w:sz w:val="18"/>
               </w:rPr>
               <w:t>Yes</w:t>
             </w:r>
@@ -1764,12 +2328,21 @@
         <w:tc>
           <w:tcPr>
             <w:tcW w:type="dxa" w:w="4896"/>
+            <w:tcMar>
+              <w:top w:w="50" w:type="dxa"/>
+              <w:bottom w:w="50" w:type="dxa"/>
+              <w:left w:w="90" w:type="dxa"/>
+              <w:right w:w="90" w:type="dxa"/>
+            </w:tcMar>
           </w:tcPr>
           <w:p>
+            <w:pPr>
+              <w:spacing w:before="0" w:after="0" w:line="252" w:lineRule="auto"/>
+            </w:pPr>
             <w:r/>
             <w:r>
               <w:rPr>
-                <w:sz w:val="19"/>
+                <w:sz w:val="18"/>
               </w:rPr>
               <w:t>Your Zscaler tenant's vanity domain</w:t>
             </w:r>
@@ -1780,12 +2353,21 @@
         <w:tc>
           <w:tcPr>
             <w:tcW w:type="dxa" w:w="2592"/>
+            <w:tcMar>
+              <w:top w:w="50" w:type="dxa"/>
+              <w:bottom w:w="50" w:type="dxa"/>
+              <w:left w:w="90" w:type="dxa"/>
+              <w:right w:w="90" w:type="dxa"/>
+            </w:tcMar>
           </w:tcPr>
           <w:p>
+            <w:pPr>
+              <w:spacing w:before="0" w:after="0" w:line="252" w:lineRule="auto"/>
+            </w:pPr>
             <w:r/>
             <w:r>
               <w:rPr>
-                <w:sz w:val="19"/>
+                <w:sz w:val="18"/>
               </w:rPr>
               <w:t>cloud</w:t>
             </w:r>
@@ -1794,12 +2376,21 @@
         <w:tc>
           <w:tcPr>
             <w:tcW w:type="dxa" w:w="1440"/>
+            <w:tcMar>
+              <w:top w:w="50" w:type="dxa"/>
+              <w:bottom w:w="50" w:type="dxa"/>
+              <w:left w:w="90" w:type="dxa"/>
+              <w:right w:w="90" w:type="dxa"/>
+            </w:tcMar>
           </w:tcPr>
           <w:p>
+            <w:pPr>
+              <w:spacing w:before="0" w:after="0" w:line="252" w:lineRule="auto"/>
+            </w:pPr>
             <w:r/>
             <w:r>
               <w:rPr>
-                <w:sz w:val="19"/>
+                <w:sz w:val="18"/>
               </w:rPr>
               <w:t>Yes</w:t>
             </w:r>
@@ -1808,12 +2399,21 @@
         <w:tc>
           <w:tcPr>
             <w:tcW w:type="dxa" w:w="4896"/>
+            <w:tcMar>
+              <w:top w:w="50" w:type="dxa"/>
+              <w:bottom w:w="50" w:type="dxa"/>
+              <w:left w:w="90" w:type="dxa"/>
+              <w:right w:w="90" w:type="dxa"/>
+            </w:tcMar>
           </w:tcPr>
           <w:p>
+            <w:pPr>
+              <w:spacing w:before="0" w:after="0" w:line="252" w:lineRule="auto"/>
+            </w:pPr>
             <w:r/>
             <w:r>
               <w:rPr>
-                <w:sz w:val="19"/>
+                <w:sz w:val="18"/>
               </w:rPr>
               <w:t>Zscaler cloud identifier (e.g. zscalerthree)</w:t>
             </w:r>
@@ -1824,12 +2424,21 @@
         <w:tc>
           <w:tcPr>
             <w:tcW w:type="dxa" w:w="2592"/>
+            <w:tcMar>
+              <w:top w:w="50" w:type="dxa"/>
+              <w:bottom w:w="50" w:type="dxa"/>
+              <w:left w:w="90" w:type="dxa"/>
+              <w:right w:w="90" w:type="dxa"/>
+            </w:tcMar>
           </w:tcPr>
           <w:p>
+            <w:pPr>
+              <w:spacing w:before="0" w:after="0" w:line="252" w:lineRule="auto"/>
+            </w:pPr>
             <w:r/>
             <w:r>
               <w:rPr>
-                <w:sz w:val="19"/>
+                <w:sz w:val="18"/>
               </w:rPr>
               <w:t>login_domain</w:t>
             </w:r>
@@ -1838,12 +2447,21 @@
         <w:tc>
           <w:tcPr>
             <w:tcW w:type="dxa" w:w="1440"/>
+            <w:tcMar>
+              <w:top w:w="50" w:type="dxa"/>
+              <w:bottom w:w="50" w:type="dxa"/>
+              <w:left w:w="90" w:type="dxa"/>
+              <w:right w:w="90" w:type="dxa"/>
+            </w:tcMar>
           </w:tcPr>
           <w:p>
+            <w:pPr>
+              <w:spacing w:before="0" w:after="0" w:line="252" w:lineRule="auto"/>
+            </w:pPr>
             <w:r/>
             <w:r>
               <w:rPr>
-                <w:sz w:val="19"/>
+                <w:sz w:val="18"/>
               </w:rPr>
               <w:t>No</w:t>
             </w:r>
@@ -1852,12 +2470,21 @@
         <w:tc>
           <w:tcPr>
             <w:tcW w:type="dxa" w:w="4896"/>
+            <w:tcMar>
+              <w:top w:w="50" w:type="dxa"/>
+              <w:bottom w:w="50" w:type="dxa"/>
+              <w:left w:w="90" w:type="dxa"/>
+              <w:right w:w="90" w:type="dxa"/>
+            </w:tcMar>
           </w:tcPr>
           <w:p>
+            <w:pPr>
+              <w:spacing w:before="0" w:after="0" w:line="252" w:lineRule="auto"/>
+            </w:pPr>
             <w:r/>
             <w:r>
               <w:rPr>
-                <w:sz w:val="19"/>
+                <w:sz w:val="18"/>
               </w:rPr>
               <w:t>Override OAuth2 login domain if your tenant requires it</w:t>
             </w:r>
@@ -1865,7 +2492,11 @@
         </w:tc>
       </w:tr>
     </w:tbl>
-    <w:p/>
+    <w:p>
+      <w:pPr>
+        <w:spacing w:before="0" w:after="200" w:line="240" w:lineRule="auto"/>
+      </w:pPr>
+    </w:p>
     <w:p>
       <w:pPr>
         <w:pStyle w:val="Heading2"/>
@@ -1879,6 +2510,7 @@
         <w:tblStyle w:val="TableGrid"/>
         <w:tblW w:type="auto" w:w="0"/>
         <w:jc w:val="center"/>
+        <w:tblLayout w:type="autofit"/>
         <w:tblLook w:firstColumn="1" w:firstRow="1" w:lastColumn="0" w:lastRow="0" w:noHBand="0" w:noVBand="1" w:val="04A0"/>
       </w:tblPr>
       <w:tblGrid>
@@ -1890,15 +2522,24 @@
         <w:tc>
           <w:tcPr>
             <w:tcW w:type="dxa" w:w="2592"/>
+            <w:tcMar>
+              <w:top w:w="50" w:type="dxa"/>
+              <w:bottom w:w="50" w:type="dxa"/>
+              <w:left w:w="90" w:type="dxa"/>
+              <w:right w:w="90" w:type="dxa"/>
+            </w:tcMar>
             <w:shd w:fill="E85C2E"/>
           </w:tcPr>
           <w:p>
+            <w:pPr>
+              <w:spacing w:before="0" w:after="0" w:line="252" w:lineRule="auto"/>
+            </w:pPr>
             <w:r/>
             <w:r>
               <w:rPr>
                 <w:b/>
                 <w:color w:val="FFFFFF"/>
-                <w:sz w:val="20"/>
+                <w:sz w:val="19"/>
               </w:rPr>
               <w:t>Variable</w:t>
             </w:r>
@@ -1907,15 +2548,24 @@
         <w:tc>
           <w:tcPr>
             <w:tcW w:type="dxa" w:w="1440"/>
+            <w:tcMar>
+              <w:top w:w="50" w:type="dxa"/>
+              <w:bottom w:w="50" w:type="dxa"/>
+              <w:left w:w="90" w:type="dxa"/>
+              <w:right w:w="90" w:type="dxa"/>
+            </w:tcMar>
             <w:shd w:fill="E85C2E"/>
           </w:tcPr>
           <w:p>
+            <w:pPr>
+              <w:spacing w:before="0" w:after="0" w:line="252" w:lineRule="auto"/>
+            </w:pPr>
             <w:r/>
             <w:r>
               <w:rPr>
                 <w:b/>
                 <w:color w:val="FFFFFF"/>
-                <w:sz w:val="20"/>
+                <w:sz w:val="19"/>
               </w:rPr>
               <w:t>Required</w:t>
             </w:r>
@@ -1924,15 +2574,24 @@
         <w:tc>
           <w:tcPr>
             <w:tcW w:type="dxa" w:w="4896"/>
+            <w:tcMar>
+              <w:top w:w="50" w:type="dxa"/>
+              <w:bottom w:w="50" w:type="dxa"/>
+              <w:left w:w="90" w:type="dxa"/>
+              <w:right w:w="90" w:type="dxa"/>
+            </w:tcMar>
             <w:shd w:fill="E85C2E"/>
           </w:tcPr>
           <w:p>
+            <w:pPr>
+              <w:spacing w:before="0" w:after="0" w:line="252" w:lineRule="auto"/>
+            </w:pPr>
             <w:r/>
             <w:r>
               <w:rPr>
                 <w:b/>
                 <w:color w:val="FFFFFF"/>
-                <w:sz w:val="20"/>
+                <w:sz w:val="19"/>
               </w:rPr>
               <w:t>Description</w:t>
             </w:r>
@@ -1943,12 +2602,21 @@
         <w:tc>
           <w:tcPr>
             <w:tcW w:type="dxa" w:w="2592"/>
+            <w:tcMar>
+              <w:top w:w="50" w:type="dxa"/>
+              <w:bottom w:w="50" w:type="dxa"/>
+              <w:left w:w="90" w:type="dxa"/>
+              <w:right w:w="90" w:type="dxa"/>
+            </w:tcMar>
           </w:tcPr>
           <w:p>
+            <w:pPr>
+              <w:spacing w:before="0" w:after="0" w:line="252" w:lineRule="auto"/>
+            </w:pPr>
             <w:r/>
             <w:r>
               <w:rPr>
-                <w:sz w:val="19"/>
+                <w:sz w:val="18"/>
               </w:rPr>
               <w:t>gateway_name</w:t>
             </w:r>
@@ -1957,12 +2625,21 @@
         <w:tc>
           <w:tcPr>
             <w:tcW w:type="dxa" w:w="1440"/>
+            <w:tcMar>
+              <w:top w:w="50" w:type="dxa"/>
+              <w:bottom w:w="50" w:type="dxa"/>
+              <w:left w:w="90" w:type="dxa"/>
+              <w:right w:w="90" w:type="dxa"/>
+            </w:tcMar>
           </w:tcPr>
           <w:p>
+            <w:pPr>
+              <w:spacing w:before="0" w:after="0" w:line="252" w:lineRule="auto"/>
+            </w:pPr>
             <w:r/>
             <w:r>
               <w:rPr>
-                <w:sz w:val="19"/>
+                <w:sz w:val="18"/>
               </w:rPr>
               <w:t>Yes</w:t>
             </w:r>
@@ -1971,12 +2648,21 @@
         <w:tc>
           <w:tcPr>
             <w:tcW w:type="dxa" w:w="4896"/>
+            <w:tcMar>
+              <w:top w:w="50" w:type="dxa"/>
+              <w:bottom w:w="50" w:type="dxa"/>
+              <w:left w:w="90" w:type="dxa"/>
+              <w:right w:w="90" w:type="dxa"/>
+            </w:tcMar>
           </w:tcPr>
           <w:p>
+            <w:pPr>
+              <w:spacing w:before="0" w:after="0" w:line="252" w:lineRule="auto"/>
+            </w:pPr>
             <w:r/>
             <w:r>
               <w:rPr>
-                <w:sz w:val="19"/>
+                <w:sz w:val="18"/>
               </w:rPr>
               <w:t>Unique name for the Zero Trust Gateway</w:t>
             </w:r>
@@ -1987,12 +2673,21 @@
         <w:tc>
           <w:tcPr>
             <w:tcW w:type="dxa" w:w="2592"/>
+            <w:tcMar>
+              <w:top w:w="50" w:type="dxa"/>
+              <w:bottom w:w="50" w:type="dxa"/>
+              <w:left w:w="90" w:type="dxa"/>
+              <w:right w:w="90" w:type="dxa"/>
+            </w:tcMar>
           </w:tcPr>
           <w:p>
+            <w:pPr>
+              <w:spacing w:before="0" w:after="0" w:line="252" w:lineRule="auto"/>
+            </w:pPr>
             <w:r/>
             <w:r>
               <w:rPr>
-                <w:sz w:val="19"/>
+                <w:sz w:val="18"/>
               </w:rPr>
               <w:t>location_name</w:t>
             </w:r>
@@ -2001,12 +2696,21 @@
         <w:tc>
           <w:tcPr>
             <w:tcW w:type="dxa" w:w="1440"/>
+            <w:tcMar>
+              <w:top w:w="50" w:type="dxa"/>
+              <w:bottom w:w="50" w:type="dxa"/>
+              <w:left w:w="90" w:type="dxa"/>
+              <w:right w:w="90" w:type="dxa"/>
+            </w:tcMar>
           </w:tcPr>
           <w:p>
+            <w:pPr>
+              <w:spacing w:before="0" w:after="0" w:line="252" w:lineRule="auto"/>
+            </w:pPr>
             <w:r/>
             <w:r>
               <w:rPr>
-                <w:sz w:val="19"/>
+                <w:sz w:val="18"/>
               </w:rPr>
               <w:t>Yes</w:t>
             </w:r>
@@ -2015,12 +2719,21 @@
         <w:tc>
           <w:tcPr>
             <w:tcW w:type="dxa" w:w="4896"/>
+            <w:tcMar>
+              <w:top w:w="50" w:type="dxa"/>
+              <w:bottom w:w="50" w:type="dxa"/>
+              <w:left w:w="90" w:type="dxa"/>
+              <w:right w:w="90" w:type="dxa"/>
+            </w:tcMar>
           </w:tcPr>
           <w:p>
+            <w:pPr>
+              <w:spacing w:before="0" w:after="0" w:line="252" w:lineRule="auto"/>
+            </w:pPr>
             <w:r/>
             <w:r>
               <w:rPr>
-                <w:sz w:val="19"/>
+                <w:sz w:val="18"/>
               </w:rPr>
               <w:t>Unique Zscaler location name associated with the gateway</w:t>
             </w:r>
@@ -2031,12 +2744,21 @@
         <w:tc>
           <w:tcPr>
             <w:tcW w:type="dxa" w:w="2592"/>
+            <w:tcMar>
+              <w:top w:w="50" w:type="dxa"/>
+              <w:bottom w:w="50" w:type="dxa"/>
+              <w:left w:w="90" w:type="dxa"/>
+              <w:right w:w="90" w:type="dxa"/>
+            </w:tcMar>
           </w:tcPr>
           <w:p>
+            <w:pPr>
+              <w:spacing w:before="0" w:after="0" w:line="252" w:lineRule="auto"/>
+            </w:pPr>
             <w:r/>
             <w:r>
               <w:rPr>
-                <w:sz w:val="19"/>
+                <w:sz w:val="18"/>
               </w:rPr>
               <w:t>aws_region</w:t>
             </w:r>
@@ -2045,12 +2767,21 @@
         <w:tc>
           <w:tcPr>
             <w:tcW w:type="dxa" w:w="1440"/>
+            <w:tcMar>
+              <w:top w:w="50" w:type="dxa"/>
+              <w:bottom w:w="50" w:type="dxa"/>
+              <w:left w:w="90" w:type="dxa"/>
+              <w:right w:w="90" w:type="dxa"/>
+            </w:tcMar>
           </w:tcPr>
           <w:p>
+            <w:pPr>
+              <w:spacing w:before="0" w:after="0" w:line="252" w:lineRule="auto"/>
+            </w:pPr>
             <w:r/>
             <w:r>
               <w:rPr>
-                <w:sz w:val="19"/>
+                <w:sz w:val="18"/>
               </w:rPr>
               <w:t>Yes</w:t>
             </w:r>
@@ -2059,12 +2790,21 @@
         <w:tc>
           <w:tcPr>
             <w:tcW w:type="dxa" w:w="4896"/>
+            <w:tcMar>
+              <w:top w:w="50" w:type="dxa"/>
+              <w:bottom w:w="50" w:type="dxa"/>
+              <w:left w:w="90" w:type="dxa"/>
+              <w:right w:w="90" w:type="dxa"/>
+            </w:tcMar>
           </w:tcPr>
           <w:p>
+            <w:pPr>
+              <w:spacing w:before="0" w:after="0" w:line="252" w:lineRule="auto"/>
+            </w:pPr>
             <w:r/>
             <w:r>
               <w:rPr>
-                <w:sz w:val="19"/>
+                <w:sz w:val="18"/>
               </w:rPr>
               <w:t>AWS region for the gateway (e.g. us-west-2)</w:t>
             </w:r>
@@ -2075,12 +2815,21 @@
         <w:tc>
           <w:tcPr>
             <w:tcW w:type="dxa" w:w="2592"/>
+            <w:tcMar>
+              <w:top w:w="50" w:type="dxa"/>
+              <w:bottom w:w="50" w:type="dxa"/>
+              <w:left w:w="90" w:type="dxa"/>
+              <w:right w:w="90" w:type="dxa"/>
+            </w:tcMar>
           </w:tcPr>
           <w:p>
+            <w:pPr>
+              <w:spacing w:before="0" w:after="0" w:line="252" w:lineRule="auto"/>
+            </w:pPr>
             <w:r/>
             <w:r>
               <w:rPr>
-                <w:sz w:val="19"/>
+                <w:sz w:val="18"/>
               </w:rPr>
               <w:t>aws_region_code</w:t>
             </w:r>
@@ -2089,12 +2838,21 @@
         <w:tc>
           <w:tcPr>
             <w:tcW w:type="dxa" w:w="1440"/>
+            <w:tcMar>
+              <w:top w:w="50" w:type="dxa"/>
+              <w:bottom w:w="50" w:type="dxa"/>
+              <w:left w:w="90" w:type="dxa"/>
+              <w:right w:w="90" w:type="dxa"/>
+            </w:tcMar>
           </w:tcPr>
           <w:p>
+            <w:pPr>
+              <w:spacing w:before="0" w:after="0" w:line="252" w:lineRule="auto"/>
+            </w:pPr>
             <w:r/>
             <w:r>
               <w:rPr>
-                <w:sz w:val="19"/>
+                <w:sz w:val="18"/>
               </w:rPr>
               <w:t>Yes</w:t>
             </w:r>
@@ -2103,12 +2861,21 @@
         <w:tc>
           <w:tcPr>
             <w:tcW w:type="dxa" w:w="4896"/>
+            <w:tcMar>
+              <w:top w:w="50" w:type="dxa"/>
+              <w:bottom w:w="50" w:type="dxa"/>
+              <w:left w:w="90" w:type="dxa"/>
+              <w:right w:w="90" w:type="dxa"/>
+            </w:tcMar>
           </w:tcPr>
           <w:p>
+            <w:pPr>
+              <w:spacing w:before="0" w:after="0" w:line="252" w:lineRule="auto"/>
+            </w:pPr>
             <w:r/>
             <w:r>
               <w:rPr>
-                <w:sz w:val="19"/>
+                <w:sz w:val="18"/>
               </w:rPr>
               <w:t>Zscaler-format region code (e.g. US_WEST_2)</w:t>
             </w:r>
@@ -2119,12 +2886,21 @@
         <w:tc>
           <w:tcPr>
             <w:tcW w:type="dxa" w:w="2592"/>
+            <w:tcMar>
+              <w:top w:w="50" w:type="dxa"/>
+              <w:bottom w:w="50" w:type="dxa"/>
+              <w:left w:w="90" w:type="dxa"/>
+              <w:right w:w="90" w:type="dxa"/>
+            </w:tcMar>
           </w:tcPr>
           <w:p>
+            <w:pPr>
+              <w:spacing w:before="0" w:after="0" w:line="252" w:lineRule="auto"/>
+            </w:pPr>
             <w:r/>
             <w:r>
               <w:rPr>
-                <w:sz w:val="19"/>
+                <w:sz w:val="18"/>
               </w:rPr>
               <w:t>availability_zone_ids</w:t>
             </w:r>
@@ -2133,12 +2909,21 @@
         <w:tc>
           <w:tcPr>
             <w:tcW w:type="dxa" w:w="1440"/>
+            <w:tcMar>
+              <w:top w:w="50" w:type="dxa"/>
+              <w:bottom w:w="50" w:type="dxa"/>
+              <w:left w:w="90" w:type="dxa"/>
+              <w:right w:w="90" w:type="dxa"/>
+            </w:tcMar>
           </w:tcPr>
           <w:p>
+            <w:pPr>
+              <w:spacing w:before="0" w:after="0" w:line="252" w:lineRule="auto"/>
+            </w:pPr>
             <w:r/>
             <w:r>
               <w:rPr>
-                <w:sz w:val="19"/>
+                <w:sz w:val="18"/>
               </w:rPr>
               <w:t>No</w:t>
             </w:r>
@@ -2147,12 +2932,21 @@
         <w:tc>
           <w:tcPr>
             <w:tcW w:type="dxa" w:w="4896"/>
+            <w:tcMar>
+              <w:top w:w="50" w:type="dxa"/>
+              <w:bottom w:w="50" w:type="dxa"/>
+              <w:left w:w="90" w:type="dxa"/>
+              <w:right w:w="90" w:type="dxa"/>
+            </w:tcMar>
           </w:tcPr>
           <w:p>
+            <w:pPr>
+              <w:spacing w:before="0" w:after="0" w:line="252" w:lineRule="auto"/>
+            </w:pPr>
             <w:r/>
             <w:r>
               <w:rPr>
-                <w:sz w:val="19"/>
+                <w:sz w:val="18"/>
               </w:rPr>
               <w:t>AZ IDs; auto-discovered if left empty</w:t>
             </w:r>
@@ -2163,12 +2957,21 @@
         <w:tc>
           <w:tcPr>
             <w:tcW w:type="dxa" w:w="2592"/>
+            <w:tcMar>
+              <w:top w:w="50" w:type="dxa"/>
+              <w:bottom w:w="50" w:type="dxa"/>
+              <w:left w:w="90" w:type="dxa"/>
+              <w:right w:w="90" w:type="dxa"/>
+            </w:tcMar>
           </w:tcPr>
           <w:p>
+            <w:pPr>
+              <w:spacing w:before="0" w:after="0" w:line="252" w:lineRule="auto"/>
+            </w:pPr>
             <w:r/>
             <w:r>
               <w:rPr>
-                <w:sz w:val="19"/>
+                <w:sz w:val="18"/>
               </w:rPr>
               <w:t>additional_aws_accounts</w:t>
             </w:r>
@@ -2177,12 +2980,21 @@
         <w:tc>
           <w:tcPr>
             <w:tcW w:type="dxa" w:w="1440"/>
+            <w:tcMar>
+              <w:top w:w="50" w:type="dxa"/>
+              <w:bottom w:w="50" w:type="dxa"/>
+              <w:left w:w="90" w:type="dxa"/>
+              <w:right w:w="90" w:type="dxa"/>
+            </w:tcMar>
           </w:tcPr>
           <w:p>
+            <w:pPr>
+              <w:spacing w:before="0" w:after="0" w:line="252" w:lineRule="auto"/>
+            </w:pPr>
             <w:r/>
             <w:r>
               <w:rPr>
-                <w:sz w:val="19"/>
+                <w:sz w:val="18"/>
               </w:rPr>
               <w:t>No</w:t>
             </w:r>
@@ -2191,12 +3003,21 @@
         <w:tc>
           <w:tcPr>
             <w:tcW w:type="dxa" w:w="4896"/>
+            <w:tcMar>
+              <w:top w:w="50" w:type="dxa"/>
+              <w:bottom w:w="50" w:type="dxa"/>
+              <w:left w:w="90" w:type="dxa"/>
+              <w:right w:w="90" w:type="dxa"/>
+            </w:tcMar>
           </w:tcPr>
           <w:p>
+            <w:pPr>
+              <w:spacing w:before="0" w:after="0" w:line="252" w:lineRule="auto"/>
+            </w:pPr>
             <w:r/>
             <w:r>
               <w:rPr>
-                <w:sz w:val="19"/>
+                <w:sz w:val="18"/>
               </w:rPr>
               <w:t>AWS account IDs permitted to connect to the endpoint service</w:t>
             </w:r>
@@ -2204,7 +3025,11 @@
         </w:tc>
       </w:tr>
     </w:tbl>
-    <w:p/>
+    <w:p>
+      <w:pPr>
+        <w:spacing w:before="0" w:after="200" w:line="240" w:lineRule="auto"/>
+      </w:pPr>
+    </w:p>
     <w:p>
       <w:pPr>
         <w:pStyle w:val="Heading2"/>
@@ -2218,6 +3043,7 @@
         <w:tblStyle w:val="TableGrid"/>
         <w:tblW w:type="auto" w:w="0"/>
         <w:jc w:val="center"/>
+        <w:tblLayout w:type="autofit"/>
         <w:tblLook w:firstColumn="1" w:firstRow="1" w:lastColumn="0" w:lastRow="0" w:noHBand="0" w:noVBand="1" w:val="04A0"/>
       </w:tblPr>
       <w:tblGrid>
@@ -2229,15 +3055,24 @@
         <w:tc>
           <w:tcPr>
             <w:tcW w:type="dxa" w:w="2592"/>
+            <w:tcMar>
+              <w:top w:w="50" w:type="dxa"/>
+              <w:bottom w:w="50" w:type="dxa"/>
+              <w:left w:w="90" w:type="dxa"/>
+              <w:right w:w="90" w:type="dxa"/>
+            </w:tcMar>
             <w:shd w:fill="E85C2E"/>
           </w:tcPr>
           <w:p>
+            <w:pPr>
+              <w:spacing w:before="0" w:after="0" w:line="252" w:lineRule="auto"/>
+            </w:pPr>
             <w:r/>
             <w:r>
               <w:rPr>
                 <w:b/>
                 <w:color w:val="FFFFFF"/>
-                <w:sz w:val="20"/>
+                <w:sz w:val="19"/>
               </w:rPr>
               <w:t>Variable</w:t>
             </w:r>
@@ -2246,15 +3081,24 @@
         <w:tc>
           <w:tcPr>
             <w:tcW w:type="dxa" w:w="1440"/>
+            <w:tcMar>
+              <w:top w:w="50" w:type="dxa"/>
+              <w:bottom w:w="50" w:type="dxa"/>
+              <w:left w:w="90" w:type="dxa"/>
+              <w:right w:w="90" w:type="dxa"/>
+            </w:tcMar>
             <w:shd w:fill="E85C2E"/>
           </w:tcPr>
           <w:p>
+            <w:pPr>
+              <w:spacing w:before="0" w:after="0" w:line="252" w:lineRule="auto"/>
+            </w:pPr>
             <w:r/>
             <w:r>
               <w:rPr>
                 <w:b/>
                 <w:color w:val="FFFFFF"/>
-                <w:sz w:val="20"/>
+                <w:sz w:val="19"/>
               </w:rPr>
               <w:t>Required</w:t>
             </w:r>
@@ -2263,15 +3107,24 @@
         <w:tc>
           <w:tcPr>
             <w:tcW w:type="dxa" w:w="4896"/>
+            <w:tcMar>
+              <w:top w:w="50" w:type="dxa"/>
+              <w:bottom w:w="50" w:type="dxa"/>
+              <w:left w:w="90" w:type="dxa"/>
+              <w:right w:w="90" w:type="dxa"/>
+            </w:tcMar>
             <w:shd w:fill="E85C2E"/>
           </w:tcPr>
           <w:p>
+            <w:pPr>
+              <w:spacing w:before="0" w:after="0" w:line="252" w:lineRule="auto"/>
+            </w:pPr>
             <w:r/>
             <w:r>
               <w:rPr>
                 <w:b/>
                 <w:color w:val="FFFFFF"/>
-                <w:sz w:val="20"/>
+                <w:sz w:val="19"/>
               </w:rPr>
               <w:t>Description</w:t>
             </w:r>
@@ -2282,12 +3135,21 @@
         <w:tc>
           <w:tcPr>
             <w:tcW w:type="dxa" w:w="2592"/>
+            <w:tcMar>
+              <w:top w:w="50" w:type="dxa"/>
+              <w:bottom w:w="50" w:type="dxa"/>
+              <w:left w:w="90" w:type="dxa"/>
+              <w:right w:w="90" w:type="dxa"/>
+            </w:tcMar>
           </w:tcPr>
           <w:p>
+            <w:pPr>
+              <w:spacing w:before="0" w:after="0" w:line="252" w:lineRule="auto"/>
+            </w:pPr>
             <w:r/>
             <w:r>
               <w:rPr>
-                <w:sz w:val="19"/>
+                <w:sz w:val="18"/>
               </w:rPr>
               <w:t>consumer_vpc_id</w:t>
             </w:r>
@@ -2296,12 +3158,21 @@
         <w:tc>
           <w:tcPr>
             <w:tcW w:type="dxa" w:w="1440"/>
+            <w:tcMar>
+              <w:top w:w="50" w:type="dxa"/>
+              <w:bottom w:w="50" w:type="dxa"/>
+              <w:left w:w="90" w:type="dxa"/>
+              <w:right w:w="90" w:type="dxa"/>
+            </w:tcMar>
           </w:tcPr>
           <w:p>
+            <w:pPr>
+              <w:spacing w:before="0" w:after="0" w:line="252" w:lineRule="auto"/>
+            </w:pPr>
             <w:r/>
             <w:r>
               <w:rPr>
-                <w:sz w:val="19"/>
+                <w:sz w:val="18"/>
               </w:rPr>
               <w:t>Yes</w:t>
             </w:r>
@@ -2310,12 +3181,21 @@
         <w:tc>
           <w:tcPr>
             <w:tcW w:type="dxa" w:w="4896"/>
+            <w:tcMar>
+              <w:top w:w="50" w:type="dxa"/>
+              <w:bottom w:w="50" w:type="dxa"/>
+              <w:left w:w="90" w:type="dxa"/>
+              <w:right w:w="90" w:type="dxa"/>
+            </w:tcMar>
           </w:tcPr>
           <w:p>
+            <w:pPr>
+              <w:spacing w:before="0" w:after="0" w:line="252" w:lineRule="auto"/>
+            </w:pPr>
             <w:r/>
             <w:r>
               <w:rPr>
-                <w:sz w:val="19"/>
+                <w:sz w:val="18"/>
               </w:rPr>
               <w:t>Existing VPC ID where the endpoint will be created</w:t>
             </w:r>
@@ -2326,12 +3206,21 @@
         <w:tc>
           <w:tcPr>
             <w:tcW w:type="dxa" w:w="2592"/>
+            <w:tcMar>
+              <w:top w:w="50" w:type="dxa"/>
+              <w:bottom w:w="50" w:type="dxa"/>
+              <w:left w:w="90" w:type="dxa"/>
+              <w:right w:w="90" w:type="dxa"/>
+            </w:tcMar>
           </w:tcPr>
           <w:p>
+            <w:pPr>
+              <w:spacing w:before="0" w:after="0" w:line="252" w:lineRule="auto"/>
+            </w:pPr>
             <w:r/>
             <w:r>
               <w:rPr>
-                <w:sz w:val="19"/>
+                <w:sz w:val="18"/>
               </w:rPr>
               <w:t>consumer_subnet_ids</w:t>
             </w:r>
@@ -2340,12 +3229,21 @@
         <w:tc>
           <w:tcPr>
             <w:tcW w:type="dxa" w:w="1440"/>
+            <w:tcMar>
+              <w:top w:w="50" w:type="dxa"/>
+              <w:bottom w:w="50" w:type="dxa"/>
+              <w:left w:w="90" w:type="dxa"/>
+              <w:right w:w="90" w:type="dxa"/>
+            </w:tcMar>
           </w:tcPr>
           <w:p>
+            <w:pPr>
+              <w:spacing w:before="0" w:after="0" w:line="252" w:lineRule="auto"/>
+            </w:pPr>
             <w:r/>
             <w:r>
               <w:rPr>
-                <w:sz w:val="19"/>
+                <w:sz w:val="18"/>
               </w:rPr>
               <w:t>Yes</w:t>
             </w:r>
@@ -2354,12 +3252,21 @@
         <w:tc>
           <w:tcPr>
             <w:tcW w:type="dxa" w:w="4896"/>
+            <w:tcMar>
+              <w:top w:w="50" w:type="dxa"/>
+              <w:bottom w:w="50" w:type="dxa"/>
+              <w:left w:w="90" w:type="dxa"/>
+              <w:right w:w="90" w:type="dxa"/>
+            </w:tcMar>
           </w:tcPr>
           <w:p>
+            <w:pPr>
+              <w:spacing w:before="0" w:after="0" w:line="252" w:lineRule="auto"/>
+            </w:pPr>
             <w:r/>
             <w:r>
               <w:rPr>
-                <w:sz w:val="19"/>
+                <w:sz w:val="18"/>
               </w:rPr>
               <w:t>Existing subnet IDs, one per Availability Zone</w:t>
             </w:r>
@@ -2370,12 +3277,21 @@
         <w:tc>
           <w:tcPr>
             <w:tcW w:type="dxa" w:w="2592"/>
+            <w:tcMar>
+              <w:top w:w="50" w:type="dxa"/>
+              <w:bottom w:w="50" w:type="dxa"/>
+              <w:left w:w="90" w:type="dxa"/>
+              <w:right w:w="90" w:type="dxa"/>
+            </w:tcMar>
           </w:tcPr>
           <w:p>
+            <w:pPr>
+              <w:spacing w:before="0" w:after="0" w:line="252" w:lineRule="auto"/>
+            </w:pPr>
             <w:r/>
             <w:r>
               <w:rPr>
-                <w:sz w:val="19"/>
+                <w:sz w:val="18"/>
               </w:rPr>
               <w:t>consumer_route_cidr</w:t>
             </w:r>
@@ -2384,12 +3300,21 @@
         <w:tc>
           <w:tcPr>
             <w:tcW w:type="dxa" w:w="1440"/>
+            <w:tcMar>
+              <w:top w:w="50" w:type="dxa"/>
+              <w:bottom w:w="50" w:type="dxa"/>
+              <w:left w:w="90" w:type="dxa"/>
+              <w:right w:w="90" w:type="dxa"/>
+            </w:tcMar>
           </w:tcPr>
           <w:p>
+            <w:pPr>
+              <w:spacing w:before="0" w:after="0" w:line="252" w:lineRule="auto"/>
+            </w:pPr>
             <w:r/>
             <w:r>
               <w:rPr>
-                <w:sz w:val="19"/>
+                <w:sz w:val="18"/>
               </w:rPr>
               <w:t>No</w:t>
             </w:r>
@@ -2398,12 +3323,21 @@
         <w:tc>
           <w:tcPr>
             <w:tcW w:type="dxa" w:w="4896"/>
+            <w:tcMar>
+              <w:top w:w="50" w:type="dxa"/>
+              <w:bottom w:w="50" w:type="dxa"/>
+              <w:left w:w="90" w:type="dxa"/>
+              <w:right w:w="90" w:type="dxa"/>
+            </w:tcMar>
           </w:tcPr>
           <w:p>
+            <w:pPr>
+              <w:spacing w:before="0" w:after="0" w:line="252" w:lineRule="auto"/>
+            </w:pPr>
             <w:r/>
             <w:r>
               <w:rPr>
-                <w:sz w:val="19"/>
+                <w:sz w:val="18"/>
               </w:rPr>
               <w:t>Destination CIDR for the inspection route (default: 0.0.0.0/0)</w:t>
             </w:r>
@@ -2414,12 +3348,21 @@
         <w:tc>
           <w:tcPr>
             <w:tcW w:type="dxa" w:w="2592"/>
+            <w:tcMar>
+              <w:top w:w="50" w:type="dxa"/>
+              <w:bottom w:w="50" w:type="dxa"/>
+              <w:left w:w="90" w:type="dxa"/>
+              <w:right w:w="90" w:type="dxa"/>
+            </w:tcMar>
           </w:tcPr>
           <w:p>
+            <w:pPr>
+              <w:spacing w:before="0" w:after="0" w:line="252" w:lineRule="auto"/>
+            </w:pPr>
             <w:r/>
             <w:r>
               <w:rPr>
-                <w:sz w:val="19"/>
+                <w:sz w:val="18"/>
               </w:rPr>
               <w:t>consumer_deploy_key</w:t>
             </w:r>
@@ -2428,12 +3371,21 @@
         <w:tc>
           <w:tcPr>
             <w:tcW w:type="dxa" w:w="1440"/>
+            <w:tcMar>
+              <w:top w:w="50" w:type="dxa"/>
+              <w:bottom w:w="50" w:type="dxa"/>
+              <w:left w:w="90" w:type="dxa"/>
+              <w:right w:w="90" w:type="dxa"/>
+            </w:tcMar>
           </w:tcPr>
           <w:p>
+            <w:pPr>
+              <w:spacing w:before="0" w:after="0" w:line="252" w:lineRule="auto"/>
+            </w:pPr>
             <w:r/>
             <w:r>
               <w:rPr>
-                <w:sz w:val="19"/>
+                <w:sz w:val="18"/>
               </w:rPr>
               <w:t>No</w:t>
             </w:r>
@@ -2442,12 +3394,21 @@
         <w:tc>
           <w:tcPr>
             <w:tcW w:type="dxa" w:w="4896"/>
+            <w:tcMar>
+              <w:top w:w="50" w:type="dxa"/>
+              <w:bottom w:w="50" w:type="dxa"/>
+              <w:left w:w="90" w:type="dxa"/>
+              <w:right w:w="90" w:type="dxa"/>
+            </w:tcMar>
           </w:tcPr>
           <w:p>
+            <w:pPr>
+              <w:spacing w:before="0" w:after="0" w:line="252" w:lineRule="auto"/>
+            </w:pPr>
             <w:r/>
             <w:r>
               <w:rPr>
-                <w:sz w:val="19"/>
+                <w:sz w:val="18"/>
               </w:rPr>
               <w:t>Naming prefix applied to created resources</w:t>
             </w:r>
@@ -2455,11 +3416,10 @@
         </w:tc>
       </w:tr>
     </w:tbl>
-    <w:p/>
     <w:p>
-      <w:r>
-        <w:br w:type="page"/>
-      </w:r>
+      <w:pPr>
+        <w:spacing w:before="0" w:after="200" w:line="240" w:lineRule="auto"/>
+      </w:pPr>
     </w:p>
     <w:p>
       <w:pPr>
@@ -2470,6 +3430,9 @@
       </w:r>
     </w:p>
     <w:p>
+      <w:pPr>
+        <w:spacing w:before="0" w:after="160" w:line="276" w:lineRule="auto"/>
+      </w:pPr>
       <w:r>
         <w:t>After deployment completes, confirm success using the following checks:</w:t>
       </w:r>
@@ -2531,11 +3494,6 @@
       </w:r>
     </w:p>
     <w:p>
-      <w:r>
-        <w:br w:type="page"/>
-      </w:r>
-    </w:p>
-    <w:p>
       <w:pPr>
         <w:pStyle w:val="Heading1"/>
       </w:pPr>
@@ -2555,6 +3513,7 @@
       <w:tblPr>
         <w:tblW w:type="auto" w:w="0"/>
         <w:jc w:val="left"/>
+        <w:tblLayout w:type="autofit"/>
         <w:tblLook w:firstColumn="1" w:firstRow="1" w:lastColumn="0" w:lastRow="0" w:noHBand="0" w:noVBand="1" w:val="04A0"/>
       </w:tblPr>
       <w:tblGrid>
@@ -2565,10 +3524,16 @@
           <w:tcPr>
             <w:tcW w:type="dxa" w:w="8640"/>
             <w:shd w:fill="2D2D2D"/>
+            <w:tcMar>
+              <w:top w:w="80" w:type="dxa"/>
+              <w:bottom w:w="80" w:type="dxa"/>
+              <w:left w:w="120" w:type="dxa"/>
+              <w:right w:w="120" w:type="dxa"/>
+            </w:tcMar>
           </w:tcPr>
           <w:p>
             <w:pPr>
-              <w:spacing w:after="0" w:before="0"/>
+              <w:spacing w:before="0" w:after="0" w:line="240" w:lineRule="auto"/>
             </w:pPr>
             <w:r/>
             <w:r>
@@ -2583,8 +3548,15 @@
         </w:tc>
       </w:tr>
     </w:tbl>
-    <w:p/>
     <w:p>
+      <w:pPr>
+        <w:spacing w:before="0" w:after="160" w:line="240" w:lineRule="auto"/>
+      </w:pPr>
+    </w:p>
+    <w:p>
+      <w:pPr>
+        <w:spacing w:before="0" w:after="160" w:line="276" w:lineRule="auto"/>
+      </w:pPr>
       <w:r>
         <w:t>This removes all resources in the correct order: routes, then VPC Endpoints, then the Zero Trust Gateway itself.</w:t>
       </w:r>
@@ -2601,6 +3573,7 @@
       <w:tblPr>
         <w:tblW w:type="auto" w:w="0"/>
         <w:jc w:val="left"/>
+        <w:tblLayout w:type="autofit"/>
         <w:tblLook w:firstColumn="1" w:firstRow="1" w:lastColumn="0" w:lastRow="0" w:noHBand="0" w:noVBand="1" w:val="04A0"/>
       </w:tblPr>
       <w:tblGrid>
@@ -2611,10 +3584,16 @@
           <w:tcPr>
             <w:tcW w:type="dxa" w:w="8640"/>
             <w:shd w:fill="2D2D2D"/>
+            <w:tcMar>
+              <w:top w:w="80" w:type="dxa"/>
+              <w:bottom w:w="80" w:type="dxa"/>
+              <w:left w:w="120" w:type="dxa"/>
+              <w:right w:w="120" w:type="dxa"/>
+            </w:tcMar>
           </w:tcPr>
           <w:p>
             <w:pPr>
-              <w:spacing w:after="0" w:before="0"/>
+              <w:spacing w:before="0" w:after="0" w:line="240" w:lineRule="auto"/>
             </w:pPr>
             <w:r/>
             <w:r>
@@ -2629,8 +3608,15 @@
         </w:tc>
       </w:tr>
     </w:tbl>
-    <w:p/>
     <w:p>
+      <w:pPr>
+        <w:spacing w:before="0" w:after="160" w:line="240" w:lineRule="auto"/>
+      </w:pPr>
+    </w:p>
+    <w:p>
+      <w:pPr>
+        <w:spacing w:before="0" w:after="160" w:line="276" w:lineRule="auto"/>
+      </w:pPr>
       <w:r>
         <w:t>This performs the same cleanup via the interactive wrapper, with a confirmation prompt before proceeding.</w:t>
       </w:r>
@@ -2638,6 +3624,7 @@
     <w:tbl>
       <w:tblPr>
         <w:tblW w:type="auto" w:w="0"/>
+        <w:tblLayout w:type="autofit"/>
         <w:tblLook w:firstColumn="1" w:firstRow="1" w:lastColumn="0" w:lastRow="0" w:noHBand="0" w:noVBand="1" w:val="04A0"/>
       </w:tblPr>
       <w:tblGrid>
@@ -2648,20 +3635,29 @@
           <w:tcPr>
             <w:tcW w:type="dxa" w:w="8640"/>
             <w:shd w:fill="FFF4EF"/>
+            <w:tcMar>
+              <w:top w:w="70" w:type="dxa"/>
+              <w:bottom w:w="70" w:type="dxa"/>
+              <w:left w:w="120" w:type="dxa"/>
+              <w:right w:w="120" w:type="dxa"/>
+            </w:tcMar>
           </w:tcPr>
           <w:p>
+            <w:pPr>
+              <w:spacing w:before="0" w:after="0" w:line="276" w:lineRule="auto"/>
+            </w:pPr>
             <w:r>
               <w:rPr>
                 <w:b/>
                 <w:color w:val="E85C2E"/>
-                <w:sz w:val="21"/>
+                <w:sz w:val="20"/>
               </w:rPr>
               <w:t xml:space="preserve">Important:  </w:t>
             </w:r>
             <w:r>
               <w:rPr>
                 <w:color w:val="1A1A1A"/>
-                <w:sz w:val="21"/>
+                <w:sz w:val="20"/>
               </w:rPr>
               <w:t>Deleting a gateway does not automatically remove its associated Zscaler Location object. If you plan to redeploy using the same location name, see the Troubleshooting section below.</w:t>
             </w:r>
@@ -2669,11 +3665,10 @@
         </w:tc>
       </w:tr>
     </w:tbl>
-    <w:p/>
     <w:p>
-      <w:r>
-        <w:br w:type="page"/>
-      </w:r>
+      <w:pPr>
+        <w:spacing w:before="0" w:after="160" w:line="240" w:lineRule="auto"/>
+      </w:pPr>
     </w:p>
     <w:p>
       <w:pPr>
@@ -2684,104 +3679,129 @@
       </w:r>
     </w:p>
     <w:p>
+      <w:pPr>
+        <w:spacing w:before="40" w:after="40" w:line="240" w:lineRule="auto"/>
+      </w:pPr>
       <w:r>
         <w:rPr>
           <w:b/>
           <w:color w:val="E85C2E"/>
-          <w:sz w:val="24"/>
+          <w:sz w:val="22"/>
         </w:rPr>
         <w:t>Gateway creation fails with a generic API validation error</w:t>
       </w:r>
     </w:p>
     <w:p>
+      <w:pPr>
+        <w:spacing w:before="0" w:after="160" w:line="276" w:lineRule="auto"/>
+      </w:pPr>
       <w:r>
         <w:t>Double-check every configuration value against the Variable Reference section. A common cause is placing an AWS account ID into the wrong field — AWS account IDs belong in additional_aws_accounts, not in Zscaler-internal account/group fields.</w:t>
       </w:r>
     </w:p>
-    <w:p/>
     <w:p>
+      <w:pPr>
+        <w:spacing w:before="40" w:after="40" w:line="240" w:lineRule="auto"/>
+      </w:pPr>
       <w:r>
         <w:rPr>
           <w:b/>
           <w:color w:val="E85C2E"/>
-          <w:sz w:val="24"/>
+          <w:sz w:val="22"/>
         </w:rPr>
         <w:t>Location name already exists</w:t>
       </w:r>
     </w:p>
     <w:p>
+      <w:pPr>
+        <w:spacing w:before="0" w:after="160" w:line="276" w:lineRule="auto"/>
+      </w:pPr>
       <w:r>
         <w:t>Each gateway creates an associated Zscaler Location object. Deleting a gateway does not delete this object. If you are redeploying with a previously used location_name, choose a new, unique name instead.</w:t>
       </w:r>
     </w:p>
-    <w:p/>
     <w:p>
+      <w:pPr>
+        <w:spacing w:before="40" w:after="40" w:line="240" w:lineRule="auto"/>
+      </w:pPr>
       <w:r>
         <w:rPr>
           <w:b/>
           <w:color w:val="E85C2E"/>
-          <w:sz w:val="24"/>
+          <w:sz w:val="22"/>
         </w:rPr>
         <w:t>Cannot create gateway: pending activation changes</w:t>
       </w:r>
     </w:p>
     <w:p>
+      <w:pPr>
+        <w:spacing w:before="0" w:after="160" w:line="276" w:lineRule="auto"/>
+      </w:pPr>
       <w:r>
         <w:t>A prior configuration change in your Zscaler tenant has not yet been activated. Activate pending changes via the Zscaler Admin Portal, then retry the deployment.</w:t>
       </w:r>
     </w:p>
-    <w:p/>
     <w:p>
+      <w:pPr>
+        <w:spacing w:before="40" w:after="40" w:line="240" w:lineRule="auto"/>
+      </w:pPr>
       <w:r>
         <w:rPr>
           <w:b/>
           <w:color w:val="E85C2E"/>
-          <w:sz w:val="24"/>
+          <w:sz w:val="22"/>
         </w:rPr>
         <w:t>Only one subnet can be specified for a Gateway Load Balancer endpoint</w:t>
       </w:r>
     </w:p>
     <w:p>
+      <w:pPr>
+        <w:spacing w:before="0" w:after="160" w:line="276" w:lineRule="auto"/>
+      </w:pPr>
       <w:r>
         <w:t>This is expected AWS behavior and is already handled by this deployment — one endpoint is created per subnet automatically. If you see this error, confirm you are using the latest version of this deployment package.</w:t>
       </w:r>
     </w:p>
-    <w:p/>
     <w:p>
+      <w:pPr>
+        <w:spacing w:before="40" w:after="40" w:line="240" w:lineRule="auto"/>
+      </w:pPr>
       <w:r>
         <w:rPr>
           <w:b/>
           <w:color w:val="E85C2E"/>
-          <w:sz w:val="24"/>
+          <w:sz w:val="22"/>
         </w:rPr>
         <w:t>Route already exists</w:t>
       </w:r>
     </w:p>
     <w:p>
+      <w:pPr>
+        <w:spacing w:before="0" w:after="160" w:line="276" w:lineRule="auto"/>
+      </w:pPr>
       <w:r>
         <w:t>The destination CIDR you are routing to the GWLB Endpoint already has a route in that table (commonly an existing Internet Gateway or NAT Gateway default route). Use a dedicated subnet and route table for inspected traffic, separate from existing production routes.</w:t>
       </w:r>
     </w:p>
-    <w:p/>
     <w:p>
+      <w:pPr>
+        <w:spacing w:before="40" w:after="40" w:line="240" w:lineRule="auto"/>
+      </w:pPr>
       <w:r>
         <w:rPr>
           <w:b/>
           <w:color w:val="E85C2E"/>
-          <w:sz w:val="24"/>
+          <w:sz w:val="22"/>
         </w:rPr>
         <w:t>Gateway stuck in an initializing state</w:t>
       </w:r>
     </w:p>
     <w:p>
+      <w:pPr>
+        <w:spacing w:before="0" w:after="160" w:line="276" w:lineRule="auto"/>
+      </w:pPr>
       <w:r>
         <w:t>Provisioning typically completes within 3–10 minutes. If a timeout occurs, simply re-run the deployment command — it will detect the existing gateway and resume monitoring its health.</w:t>
-      </w:r>
-    </w:p>
-    <w:p/>
-    <w:p>
-      <w:r>
-        <w:br w:type="page"/>
       </w:r>
     </w:p>
     <w:p>
@@ -2848,10 +3868,14 @@
         <w:t xml:space="preserve"> Consider storing your Terraform state in a secure, access-controlled remote backend (e.g. an encrypted S3 bucket with restricted access) rather than locally, especially for production environments.</w:t>
       </w:r>
     </w:p>
-    <w:p/>
-    <w:p/>
     <w:p>
       <w:pPr>
+        <w:spacing w:before="0" w:after="400" w:line="240" w:lineRule="auto"/>
+      </w:pPr>
+    </w:p>
+    <w:p>
+      <w:pPr>
+        <w:spacing w:before="0" w:after="0" w:line="240" w:lineRule="auto"/>
         <w:jc w:val="center"/>
       </w:pPr>
       <w:r>
@@ -2878,6 +3902,7 @@
   <w:p>
     <w:pPr>
       <w:pStyle w:val="Footer"/>
+      <w:spacing w:before="0" w:after="0" w:line="240" w:lineRule="auto"/>
       <w:jc w:val="center"/>
     </w:pPr>
     <w:r>
@@ -3256,10 +4281,13 @@
     <w:name w:val="Normal"/>
     <w:qFormat/>
     <w:rsid w:val="00FC693F"/>
+    <w:pPr>
+      <w:spacing w:before="0" w:after="120" w:line="276" w:lineRule="auto"/>
+    </w:pPr>
     <w:rPr>
       <w:rFonts w:ascii="Calibri" w:hAnsi="Calibri"/>
       <w:color w:val="1A1A1A"/>
-      <w:sz w:val="22"/>
+      <w:sz w:val="21"/>
     </w:rPr>
   </w:style>
   <w:style w:type="paragraph" w:styleId="Header">
@@ -3317,7 +4345,7 @@
     <w:pPr>
       <w:keepNext/>
       <w:keepLines/>
-      <w:spacing w:before="480" w:after="0"/>
+      <w:spacing w:before="360" w:after="120"/>
       <w:outlineLvl w:val="0"/>
     </w:pPr>
     <w:rPr>
@@ -3325,7 +4353,7 @@
       <w:b/>
       <w:bCs/>
       <w:color w:val="E85C2E"/>
-      <w:sz w:val="52"/>
+      <w:sz w:val="44"/>
       <w:szCs w:val="28"/>
     </w:rPr>
   </w:style>
@@ -3341,7 +4369,7 @@
     <w:pPr>
       <w:keepNext/>
       <w:keepLines/>
-      <w:spacing w:before="200" w:after="0"/>
+      <w:spacing w:before="280" w:after="80"/>
       <w:outlineLvl w:val="1"/>
     </w:pPr>
     <w:rPr>
@@ -3349,7 +4377,7 @@
       <w:b/>
       <w:bCs/>
       <w:color w:val="E85C2E"/>
-      <w:sz w:val="36"/>
+      <w:sz w:val="30"/>
       <w:szCs w:val="26"/>
     </w:rPr>
   </w:style>
@@ -3365,7 +4393,7 @@
     <w:pPr>
       <w:keepNext/>
       <w:keepLines/>
-      <w:spacing w:before="200" w:after="0"/>
+      <w:spacing w:before="200" w:after="60"/>
       <w:outlineLvl w:val="2"/>
     </w:pPr>
     <w:rPr>
@@ -3373,7 +4401,7 @@
       <w:b/>
       <w:bCs/>
       <w:color w:val="E85C2E"/>
-      <w:sz w:val="28"/>
+      <w:sz w:val="25"/>
     </w:rPr>
   </w:style>
   <w:style w:type="paragraph" w:styleId="Heading4">
@@ -3789,8 +4817,13 @@
       <w:numPr>
         <w:numId w:val="1"/>
       </w:numPr>
+      <w:spacing w:before="0" w:after="40" w:line="264" w:lineRule="auto"/>
       <w:contextualSpacing/>
     </w:pPr>
+    <w:rPr>
+      <w:rFonts w:ascii="Calibri" w:hAnsi="Calibri"/>
+      <w:sz w:val="21"/>
+    </w:rPr>
   </w:style>
   <w:style w:type="paragraph" w:styleId="ListBullet2">
     <w:name w:val="List Bullet 2"/>
@@ -3828,8 +4861,13 @@
       <w:numPr>
         <w:numId w:val="5"/>
       </w:numPr>
+      <w:spacing w:before="0" w:after="40" w:line="264" w:lineRule="auto"/>
       <w:contextualSpacing/>
     </w:pPr>
+    <w:rPr>
+      <w:rFonts w:ascii="Calibri" w:hAnsi="Calibri"/>
+      <w:sz w:val="21"/>
+    </w:rPr>
   </w:style>
   <w:style w:type="paragraph" w:styleId="ListNumber2">
     <w:name w:val="List Number 2"/>

</xml_diff>